<commit_message>
Pedido 17 — Adicional Noturno: condicional noturno_ativo no template e route.ts
</commit_message>
<xml_diff>
--- a/public/template-at/template-at.docx
+++ b/public/template-at/template-at.docx
@@ -9078,6 +9078,19 @@
     </w:p>
     <w:p>
       <w:pPr>
+        <w:rPr>
+          <w:vanish/>
+        </w:rPr>
+      </w:pPr>
+      <w:r>
+        <w:rPr>
+          <w:vanish/>
+        </w:rPr>
+        <w:t>{#noturno_ativo}</w:t>
+      </w:r>
+    </w:p>
+    <w:p>
+      <w:pPr>
         <w:spacing w:after="0" w:line="360" w:lineRule="auto"/>
         <w:jc w:val="both"/>
         <w:rPr>
@@ -9329,6 +9342,19 @@
           <w:szCs w:val="24"/>
         </w:rPr>
       </w:pPr>
+    </w:p>
+    <w:p>
+      <w:pPr>
+        <w:rPr>
+          <w:vanish/>
+        </w:rPr>
+      </w:pPr>
+      <w:r>
+        <w:rPr>
+          <w:vanish/>
+        </w:rPr>
+        <w:t>{/noturno_ativo}</w:t>
+      </w:r>
     </w:p>
     <w:p>
       <w:pPr>

</xml_diff>

<commit_message>
Pedidos 18–22: condicionais no template, correção vinculoAtivo e versão no app
- Pedido 18 (Repouso Semanal): condicional repouso_ativo
- Pedido 19 (Quebra de Caixa): condicional caixa_ativo + campo no BlocoContrato
- Pedido 20 (Aviso Prévio): condicional aviso_previo_ativo + campo situação no BlocoRescisao
- Pedido 21 (Multa 477): condicional multa_477_ativa
- Pedido 22 (Seguro Desemprego): condicional seguro_desemprego_ativo
- Fix: vinculoAtivo exclui obs_geral_bloco e ignorar (consistente com isRelevant)
- Versão do app exibida na tela inicial baseada em commits git

Co-Authored-By: Claude Haiku 4.5 <noreply@anthropic.com>
</commit_message>
<xml_diff>
--- a/public/template-at/template-at.docx
+++ b/public/template-at/template-at.docx
@@ -9358,6 +9358,19 @@
     </w:p>
     <w:p>
       <w:pPr>
+        <w:rPr>
+          <w:vanish/>
+        </w:rPr>
+      </w:pPr>
+      <w:r>
+        <w:rPr>
+          <w:vanish/>
+        </w:rPr>
+        <w:t>{#repouso_ativo}</w:t>
+      </w:r>
+    </w:p>
+    <w:p>
+      <w:pPr>
         <w:spacing w:after="0" w:line="360" w:lineRule="auto"/>
         <w:jc w:val="both"/>
         <w:rPr>
@@ -9565,6 +9578,32 @@
           <w:rFonts w:ascii="Arial Narrow" w:hAnsi="Arial Narrow" w:cs="Arial"/>
         </w:rPr>
       </w:pPr>
+    </w:p>
+    <w:p>
+      <w:pPr>
+        <w:rPr>
+          <w:vanish/>
+        </w:rPr>
+      </w:pPr>
+      <w:r>
+        <w:rPr>
+          <w:vanish/>
+        </w:rPr>
+        <w:t>{/repouso_ativo}</w:t>
+      </w:r>
+    </w:p>
+    <w:p>
+      <w:pPr>
+        <w:rPr>
+          <w:vanish/>
+        </w:rPr>
+      </w:pPr>
+      <w:r>
+        <w:rPr>
+          <w:vanish/>
+        </w:rPr>
+        <w:t>{#caixa_ativo}</w:t>
+      </w:r>
     </w:p>
     <w:p>
       <w:pPr>
@@ -9794,6 +9833,32 @@
     </w:p>
     <w:p>
       <w:pPr>
+        <w:rPr>
+          <w:vanish/>
+        </w:rPr>
+      </w:pPr>
+      <w:r>
+        <w:rPr>
+          <w:vanish/>
+        </w:rPr>
+        <w:t>{/caixa_ativo}</w:t>
+      </w:r>
+    </w:p>
+    <w:p>
+      <w:pPr>
+        <w:rPr>
+          <w:vanish/>
+        </w:rPr>
+      </w:pPr>
+      <w:r>
+        <w:rPr>
+          <w:vanish/>
+        </w:rPr>
+        <w:t>{#aviso_previo_ativo}</w:t>
+      </w:r>
+    </w:p>
+    <w:p>
+      <w:pPr>
         <w:spacing w:after="0" w:line="360" w:lineRule="auto"/>
         <w:jc w:val="both"/>
         <w:rPr>
@@ -10153,6 +10218,32 @@
     </w:p>
     <w:p>
       <w:pPr>
+        <w:rPr>
+          <w:vanish/>
+        </w:rPr>
+      </w:pPr>
+      <w:r>
+        <w:rPr>
+          <w:vanish/>
+        </w:rPr>
+        <w:t>{/aviso_previo_ativo}</w:t>
+      </w:r>
+    </w:p>
+    <w:p>
+      <w:pPr>
+        <w:rPr>
+          <w:vanish/>
+        </w:rPr>
+      </w:pPr>
+      <w:r>
+        <w:rPr>
+          <w:vanish/>
+        </w:rPr>
+        <w:t>{#multa_477_ativa}</w:t>
+      </w:r>
+    </w:p>
+    <w:p>
+      <w:pPr>
         <w:spacing w:after="0" w:line="360" w:lineRule="auto"/>
         <w:jc w:val="both"/>
         <w:rPr>
@@ -10519,6 +10610,32 @@
           <w:szCs w:val="24"/>
         </w:rPr>
       </w:pPr>
+    </w:p>
+    <w:p>
+      <w:pPr>
+        <w:rPr>
+          <w:vanish/>
+        </w:rPr>
+      </w:pPr>
+      <w:r>
+        <w:rPr>
+          <w:vanish/>
+        </w:rPr>
+        <w:t>{/multa_477_ativa}</w:t>
+      </w:r>
+    </w:p>
+    <w:p>
+      <w:pPr>
+        <w:rPr>
+          <w:vanish/>
+        </w:rPr>
+      </w:pPr>
+      <w:r>
+        <w:rPr>
+          <w:vanish/>
+        </w:rPr>
+        <w:t>{#seguro_desemprego_ativo}</w:t>
+      </w:r>
     </w:p>
     <w:p>
       <w:pPr>
@@ -10967,6 +11084,19 @@
           <w:szCs w:val="24"/>
         </w:rPr>
       </w:pPr>
+    </w:p>
+    <w:p>
+      <w:pPr>
+        <w:rPr>
+          <w:vanish/>
+        </w:rPr>
+      </w:pPr>
+      <w:r>
+        <w:rPr>
+          <w:vanish/>
+        </w:rPr>
+        <w:t>{/seguro_desemprego_ativo}</w:t>
+      </w:r>
     </w:p>
     <w:p>
       <w:pPr>

</xml_diff>

<commit_message>
Pedidos 25-32: condicionais no template e ajustes nos blocos
- Pedido 25 (assédio sexual), 26 (CTPS), 27 (insalubridade), 28 (pausas térmicas), 29 (reversão justa causa), 31 (acidente), 32 (doença ocupacional): condicionais no template e variáveis no route.ts
- Pedido 30 (dependente químico) e pedido 23 (uso de imagem) removidos do template
- BlocoRescisao: campo motivo substituído por dropdown de tipo de rescisão; condicional "reversão de justa causa"
- BlocoInsalubridade: novo agente "Limpeza de banheiro"; campo "grau correto" quando insalubridade marcada
- BlocoAcidente: opção "Suspeita" removida de doença ocupacional
- FormField: novo tipo "select" (dropdown nativo)
- Sidebar: espaço fixo para checkmark evita quebra de texto nos itens do menu

Co-Authored-By: Claude Sonnet 4.6 <noreply@anthropic.com>
</commit_message>
<xml_diff>
--- a/public/template-at/template-at.docx
+++ b/public/template-at/template-at.docx
@@ -11063,30 +11063,7 @@
     </w:p>
     <w:p>
       <w:pPr>
-        <w:spacing w:after="0" w:line="360" w:lineRule="auto"/>
-        <w:ind w:firstLine="2552"/>
-        <w:jc w:val="both"/>
-        <w:rPr>
-          <w:rFonts w:ascii="Arial Narrow" w:hAnsi="Arial Narrow" w:cs="Arial"/>
-          <w:sz w:val="24"/>
-          <w:szCs w:val="24"/>
-        </w:rPr>
-      </w:pPr>
-    </w:p>
-    <w:p>
-      <w:pPr>
-        <w:spacing w:after="0" w:line="360" w:lineRule="auto"/>
-        <w:ind w:firstLine="2552"/>
-        <w:jc w:val="both"/>
-        <w:rPr>
-          <w:rFonts w:ascii="Arial Narrow" w:hAnsi="Arial Narrow" w:cs="Arial"/>
-          <w:sz w:val="24"/>
-          <w:szCs w:val="24"/>
-        </w:rPr>
-      </w:pPr>
-    </w:p>
-    <w:p>
-      <w:pPr>
+        <w:pStyle w:val="Normal"/>
         <w:rPr>
           <w:vanish/>
         </w:rPr>
@@ -11100,20 +11077,59 @@
     </w:p>
     <w:p>
       <w:pPr>
-        <w:spacing w:after="0" w:line="360" w:lineRule="auto"/>
-        <w:jc w:val="both"/>
-        <w:rPr>
-          <w:rFonts w:ascii="Arial Narrow" w:hAnsi="Arial Narrow" w:cs="Arial"/>
-          <w:b/>
-          <w:i/>
-          <w:sz w:val="24"/>
-          <w:szCs w:val="24"/>
-        </w:rPr>
-      </w:pPr>
-      <w:r>
-        <w:rPr>
-          <w:rFonts w:ascii="Arial Narrow" w:hAnsi="Arial Narrow" w:cs="Arial"/>
-          <w:b/>
+        <w:pStyle w:val="Normal"/>
+        <w:rPr>
+          <w:vanish/>
+        </w:rPr>
+      </w:pPr>
+      <w:r>
+        <w:rPr>
+          <w:vanish/>
+        </w:rPr>
+        <w:t>{#assedio_ativo}</w:t>
+      </w:r>
+    </w:p>
+    <w:p>
+      <w:pPr>
+        <w:spacing w:after="0" w:line="360" w:lineRule="auto"/>
+        <w:jc w:val="both"/>
+        <w:rPr>
+          <w:rFonts w:ascii="Arial Narrow" w:hAnsi="Arial Narrow" w:cs="Arial"/>
+          <w:sz w:val="24"/>
+          <w:szCs w:val="24"/>
+        </w:rPr>
+      </w:pPr>
+    </w:p>
+    <w:p>
+      <w:pPr>
+        <w:spacing w:after="0" w:line="360" w:lineRule="auto"/>
+        <w:ind w:firstLine="2552"/>
+        <w:jc w:val="both"/>
+        <w:rPr>
+          <w:rFonts w:ascii="Arial Narrow" w:hAnsi="Arial Narrow" w:cs="Arial"/>
+          <w:sz w:val="24"/>
+          <w:szCs w:val="24"/>
+        </w:rPr>
+      </w:pPr>
+    </w:p>
+    <w:p>
+      <w:pPr>
+        <w:spacing w:after="0" w:line="360" w:lineRule="auto"/>
+        <w:jc w:val="both"/>
+        <w:rPr>
+          <w:rFonts w:ascii="Arial Narrow" w:hAnsi="Arial Narrow" w:cs="Arial"/>
+          <w:b/>
+          <w:bCs/>
+          <w:i/>
+          <w:sz w:val="24"/>
+          <w:szCs w:val="24"/>
+        </w:rPr>
+      </w:pPr>
+      <w:r>
+        <w:rPr>
+          <w:rFonts w:ascii="Arial Narrow" w:hAnsi="Arial Narrow" w:cs="Arial"/>
+          <w:b/>
+          <w:bCs/>
           <w:i/>
           <w:sz w:val="24"/>
           <w:szCs w:val="24"/>
@@ -11124,1702 +11140,312 @@
         <w:rPr>
           <w:rFonts w:ascii="Arial Narrow" w:hAnsi="Arial Narrow" w:cs="Arial"/>
           <w:b/>
-          <w:i/>
-          <w:sz w:val="24"/>
-          <w:szCs w:val="24"/>
-        </w:rPr>
-        <w:t>3</w:t>
-      </w:r>
-      <w:r>
-        <w:rPr>
-          <w:rFonts w:ascii="Arial Narrow" w:hAnsi="Arial Narrow" w:cs="Arial"/>
-          <w:b/>
-          <w:i/>
-          <w:sz w:val="24"/>
-          <w:szCs w:val="24"/>
-        </w:rPr>
-        <w:t xml:space="preserve">. – </w:t>
-      </w:r>
-      <w:r>
-        <w:rPr>
-          <w:rFonts w:ascii="Arial Narrow" w:hAnsi="Arial Narrow" w:cs="Arial"/>
-          <w:b/>
-          <w:i/>
-          <w:sz w:val="24"/>
-          <w:szCs w:val="24"/>
-        </w:rPr>
-        <w:t>Dano moral</w:t>
-      </w:r>
-      <w:r>
-        <w:rPr>
-          <w:rFonts w:ascii="Arial Narrow" w:hAnsi="Arial Narrow" w:cs="Arial"/>
-          <w:b/>
-          <w:i/>
-          <w:sz w:val="24"/>
-          <w:szCs w:val="24"/>
-        </w:rPr>
-        <w:t xml:space="preserve">: </w:t>
-      </w:r>
-      <w:r>
-        <w:rPr>
-          <w:rFonts w:ascii="Arial Narrow" w:hAnsi="Arial Narrow" w:cs="Arial"/>
-          <w:b/>
-          <w:i/>
-          <w:sz w:val="24"/>
-          <w:szCs w:val="24"/>
-        </w:rPr>
-        <w:t>u</w:t>
-      </w:r>
-      <w:r>
-        <w:rPr>
-          <w:rFonts w:ascii="Arial Narrow" w:hAnsi="Arial Narrow" w:cs="Arial"/>
-          <w:b/>
-          <w:i/>
-          <w:sz w:val="24"/>
-          <w:szCs w:val="24"/>
-        </w:rPr>
-        <w:t>so</w:t>
-      </w:r>
-      <w:r>
-        <w:rPr>
-          <w:rFonts w:ascii="Arial Narrow" w:hAnsi="Arial Narrow" w:cs="Arial"/>
-          <w:b/>
-          <w:i/>
-          <w:sz w:val="24"/>
-          <w:szCs w:val="24"/>
-        </w:rPr>
-        <w:t xml:space="preserve"> comercial d</w:t>
-      </w:r>
-      <w:r>
-        <w:rPr>
-          <w:rFonts w:ascii="Arial Narrow" w:hAnsi="Arial Narrow" w:cs="Arial"/>
-          <w:b/>
-          <w:i/>
-          <w:sz w:val="24"/>
-          <w:szCs w:val="24"/>
-        </w:rPr>
-        <w:t>a imagem de funcionário(a)</w:t>
-      </w:r>
-      <w:r>
-        <w:rPr>
-          <w:rFonts w:ascii="Arial Narrow" w:hAnsi="Arial Narrow" w:cs="Arial"/>
-          <w:b/>
-          <w:i/>
-          <w:sz w:val="24"/>
-          <w:szCs w:val="24"/>
-        </w:rPr>
-        <w:t xml:space="preserve"> sem a autorização expressa</w:t>
-      </w:r>
-      <w:r>
-        <w:rPr>
-          <w:rFonts w:ascii="Arial Narrow" w:hAnsi="Arial Narrow" w:cs="Arial"/>
-          <w:b/>
-          <w:i/>
-          <w:sz w:val="24"/>
-          <w:szCs w:val="24"/>
-        </w:rPr>
-        <w:t>.</w:t>
-      </w:r>
-    </w:p>
-    <w:p>
-      <w:pPr>
-        <w:spacing w:after="0" w:line="360" w:lineRule="auto"/>
-        <w:ind w:firstLine="2552"/>
-        <w:jc w:val="both"/>
-        <w:rPr>
-          <w:rFonts w:ascii="Arial Narrow" w:hAnsi="Arial Narrow" w:cs="Arial"/>
-          <w:sz w:val="24"/>
-          <w:szCs w:val="24"/>
-        </w:rPr>
-      </w:pPr>
-    </w:p>
-    <w:p>
-      <w:pPr>
-        <w:spacing w:after="0" w:line="360" w:lineRule="auto"/>
-        <w:ind w:firstLine="2552"/>
-        <w:jc w:val="both"/>
-        <w:rPr>
-          <w:rFonts w:ascii="Arial Narrow" w:hAnsi="Arial Narrow" w:cs="Arial"/>
-          <w:sz w:val="24"/>
-          <w:szCs w:val="24"/>
-        </w:rPr>
-      </w:pPr>
-    </w:p>
-    <w:p>
-      <w:pPr>
-        <w:spacing w:after="0" w:line="360" w:lineRule="auto"/>
-        <w:ind w:firstLine="2552"/>
-        <w:jc w:val="both"/>
-        <w:rPr>
-          <w:rFonts w:ascii="Arial Narrow" w:hAnsi="Arial Narrow" w:cs="Arial"/>
-          <w:sz w:val="24"/>
-          <w:szCs w:val="24"/>
-        </w:rPr>
-      </w:pPr>
-      <w:r>
-        <w:rPr>
-          <w:rFonts w:ascii="Arial Narrow" w:hAnsi="Arial Narrow" w:cs="Arial"/>
-          <w:sz w:val="24"/>
-          <w:szCs w:val="24"/>
-        </w:rPr>
-        <w:t xml:space="preserve">Consoante o afirmado em súmula fática, durante todo o contrato de trabalho </w:t>
-      </w:r>
-      <w:r>
-        <w:rPr>
-          <w:rFonts w:ascii="Arial Narrow" w:hAnsi="Arial Narrow" w:cs="Arial"/>
-          <w:sz w:val="24"/>
-          <w:szCs w:val="24"/>
-        </w:rPr>
-        <w:t>a parte</w:t>
-      </w:r>
-      <w:r>
-        <w:rPr>
-          <w:rFonts w:ascii="Arial Narrow" w:hAnsi="Arial Narrow" w:cs="Arial"/>
-          <w:sz w:val="24"/>
-          <w:szCs w:val="24"/>
-        </w:rPr>
-        <w:t xml:space="preserve"> Ré se utilizou </w:t>
-      </w:r>
-      <w:r>
-        <w:rPr>
-          <w:rFonts w:ascii="Arial Narrow" w:hAnsi="Arial Narrow" w:cs="Arial"/>
-          <w:sz w:val="24"/>
-          <w:szCs w:val="24"/>
-        </w:rPr>
-        <w:t>da imagem da parte Autora</w:t>
-      </w:r>
-      <w:r>
-        <w:rPr>
-          <w:rFonts w:ascii="Arial Narrow" w:hAnsi="Arial Narrow" w:cs="Arial"/>
-          <w:sz w:val="24"/>
-          <w:szCs w:val="24"/>
-        </w:rPr>
-        <w:t xml:space="preserve">, da mais variada forma, com o único fito de divulgar a </w:t>
-      </w:r>
-      <w:r>
-        <w:rPr>
-          <w:rFonts w:ascii="Arial Narrow" w:hAnsi="Arial Narrow" w:cs="Arial"/>
-          <w:sz w:val="24"/>
-          <w:szCs w:val="24"/>
-        </w:rPr>
-        <w:t xml:space="preserve">parte </w:t>
-      </w:r>
-      <w:r>
-        <w:rPr>
-          <w:rFonts w:ascii="Arial Narrow" w:hAnsi="Arial Narrow" w:cs="Arial"/>
-          <w:sz w:val="24"/>
-          <w:szCs w:val="24"/>
-        </w:rPr>
-        <w:t>Ré e o seu empreendimento. N</w:t>
-      </w:r>
-      <w:r>
-        <w:rPr>
-          <w:rFonts w:ascii="Arial Narrow" w:hAnsi="Arial Narrow" w:cs="Arial"/>
-          <w:sz w:val="24"/>
-          <w:szCs w:val="24"/>
-        </w:rPr>
-        <w:t>o entanto, a parte</w:t>
-      </w:r>
-      <w:r>
-        <w:rPr>
-          <w:rFonts w:ascii="Arial Narrow" w:hAnsi="Arial Narrow" w:cs="Arial"/>
-          <w:sz w:val="24"/>
-          <w:szCs w:val="24"/>
-        </w:rPr>
-        <w:t xml:space="preserve"> Autor</w:t>
-      </w:r>
-      <w:r>
-        <w:rPr>
-          <w:rFonts w:ascii="Arial Narrow" w:hAnsi="Arial Narrow" w:cs="Arial"/>
-          <w:sz w:val="24"/>
-          <w:szCs w:val="24"/>
-        </w:rPr>
-        <w:t>a</w:t>
-      </w:r>
-      <w:r>
-        <w:rPr>
-          <w:rFonts w:ascii="Arial Narrow" w:hAnsi="Arial Narrow" w:cs="Arial"/>
-          <w:sz w:val="24"/>
-          <w:szCs w:val="24"/>
-        </w:rPr>
-        <w:t xml:space="preserve"> nunca recebeu qualquer </w:t>
+          <w:bCs/>
+          <w:i/>
+          <w:sz w:val="24"/>
+          <w:szCs w:val="24"/>
+        </w:rPr>
+        <w:t>4</w:t>
+      </w:r>
+      <w:r>
+        <w:rPr>
+          <w:rFonts w:ascii="Arial Narrow" w:hAnsi="Arial Narrow" w:cs="Arial"/>
+          <w:b/>
+          <w:bCs/>
+          <w:i/>
+          <w:sz w:val="24"/>
+          <w:szCs w:val="24"/>
+        </w:rPr>
+        <w:t>. – Assédio moral.</w:t>
+      </w:r>
+    </w:p>
+    <w:p>
+      <w:pPr>
+        <w:spacing w:after="0" w:line="360" w:lineRule="auto"/>
+        <w:jc w:val="both"/>
+        <w:rPr>
+          <w:rFonts w:ascii="Arial Narrow" w:hAnsi="Arial Narrow" w:cs="Arial"/>
+          <w:b/>
+          <w:bCs/>
+          <w:i/>
+          <w:sz w:val="24"/>
+          <w:szCs w:val="24"/>
+        </w:rPr>
+      </w:pPr>
+    </w:p>
+    <w:p>
+      <w:pPr>
+        <w:spacing w:after="0" w:line="360" w:lineRule="auto"/>
+        <w:ind w:firstLine="2552"/>
+        <w:jc w:val="both"/>
+        <w:rPr>
+          <w:rFonts w:ascii="Arial Narrow" w:hAnsi="Arial Narrow" w:cs="Arial"/>
+          <w:bCs/>
+          <w:sz w:val="24"/>
+          <w:szCs w:val="24"/>
+        </w:rPr>
+      </w:pPr>
+    </w:p>
+    <w:p>
+      <w:pPr>
+        <w:spacing w:after="0" w:line="360" w:lineRule="auto"/>
+        <w:ind w:firstLine="2552"/>
+        <w:jc w:val="both"/>
+        <w:rPr>
+          <w:rFonts w:ascii="Arial Narrow" w:hAnsi="Arial Narrow" w:cs="Arial"/>
+          <w:bCs/>
+          <w:sz w:val="24"/>
+          <w:szCs w:val="24"/>
+        </w:rPr>
+      </w:pPr>
+      <w:r>
+        <w:rPr>
+          <w:rFonts w:ascii="Arial Narrow" w:hAnsi="Arial Narrow" w:cs="Arial"/>
+          <w:bCs/>
+          <w:sz w:val="24"/>
+          <w:szCs w:val="24"/>
+        </w:rPr>
+        <w:t xml:space="preserve">A “coação moral” decorre, </w:t>
+      </w:r>
+      <w:r>
+        <w:rPr>
+          <w:rFonts w:ascii="Arial Narrow" w:hAnsi="Arial Narrow" w:cs="Arial"/>
+          <w:bCs/>
+          <w:i/>
+          <w:sz w:val="24"/>
+          <w:szCs w:val="24"/>
+        </w:rPr>
+        <w:t xml:space="preserve">in </w:t>
       </w:r>
       <w:proofErr w:type="spellStart"/>
       <w:r>
         <w:rPr>
           <w:rFonts w:ascii="Arial Narrow" w:hAnsi="Arial Narrow" w:cs="Arial"/>
-          <w:sz w:val="24"/>
-          <w:szCs w:val="24"/>
-        </w:rPr>
-        <w:t>contra-prestação</w:t>
+          <w:bCs/>
+          <w:i/>
+          <w:sz w:val="24"/>
+          <w:szCs w:val="24"/>
+        </w:rPr>
+        <w:t>casu</w:t>
       </w:r>
       <w:proofErr w:type="spellEnd"/>
       <w:r>
         <w:rPr>
           <w:rFonts w:ascii="Arial Narrow" w:hAnsi="Arial Narrow" w:cs="Arial"/>
-          <w:sz w:val="24"/>
-          <w:szCs w:val="24"/>
-        </w:rPr>
-        <w:t xml:space="preserve"> da </w:t>
-      </w:r>
-      <w:r>
-        <w:rPr>
-          <w:rFonts w:ascii="Arial Narrow" w:hAnsi="Arial Narrow" w:cs="Arial"/>
-          <w:sz w:val="24"/>
-          <w:szCs w:val="24"/>
-        </w:rPr>
-        <w:t>empregadora</w:t>
-      </w:r>
-      <w:r>
-        <w:rPr>
-          <w:rFonts w:ascii="Arial Narrow" w:hAnsi="Arial Narrow" w:cs="Arial"/>
-          <w:sz w:val="24"/>
-          <w:szCs w:val="24"/>
-        </w:rPr>
-        <w:t xml:space="preserve"> pela utilização de sua imagem.</w:t>
-      </w:r>
-    </w:p>
-    <w:p>
-      <w:pPr>
-        <w:spacing w:after="0" w:line="360" w:lineRule="auto"/>
-        <w:ind w:firstLine="2552"/>
-        <w:jc w:val="both"/>
-        <w:rPr>
-          <w:rFonts w:ascii="Arial Narrow" w:hAnsi="Arial Narrow" w:cs="Arial"/>
-          <w:sz w:val="24"/>
-          <w:szCs w:val="24"/>
-        </w:rPr>
-      </w:pPr>
-    </w:p>
-    <w:p>
-      <w:pPr>
-        <w:spacing w:after="0" w:line="360" w:lineRule="auto"/>
-        <w:ind w:firstLine="2552"/>
-        <w:jc w:val="both"/>
-        <w:rPr>
-          <w:rFonts w:ascii="Arial Narrow" w:hAnsi="Arial Narrow" w:cs="Arial"/>
-          <w:sz w:val="24"/>
-          <w:szCs w:val="24"/>
-        </w:rPr>
-      </w:pPr>
-      <w:r>
-        <w:rPr>
-          <w:rFonts w:ascii="Arial Narrow" w:hAnsi="Arial Narrow" w:cs="Arial"/>
-          <w:sz w:val="24"/>
-          <w:szCs w:val="24"/>
-        </w:rPr>
-        <w:t>Ora Excelência, consabido que o</w:t>
-      </w:r>
-      <w:r>
-        <w:rPr>
-          <w:rFonts w:ascii="Arial Narrow" w:hAnsi="Arial Narrow" w:cs="Arial"/>
-          <w:sz w:val="24"/>
-          <w:szCs w:val="24"/>
-        </w:rPr>
-        <w:t xml:space="preserve"> direito à imagem é um dos direitos de personalidade alçados a nível constitucional, consoante disposição expressa de nossa Carta Maior:</w:t>
-      </w:r>
-    </w:p>
-    <w:p>
-      <w:pPr>
-        <w:spacing w:after="0" w:line="360" w:lineRule="auto"/>
-        <w:ind w:firstLine="2552"/>
-        <w:jc w:val="both"/>
-        <w:rPr>
-          <w:rFonts w:ascii="Arial Narrow" w:hAnsi="Arial Narrow" w:cs="Arial"/>
-          <w:sz w:val="24"/>
-          <w:szCs w:val="24"/>
-        </w:rPr>
-      </w:pPr>
-    </w:p>
-    <w:p>
-      <w:pPr>
-        <w:spacing w:after="0" w:line="360" w:lineRule="auto"/>
-        <w:ind w:left="1134"/>
-        <w:jc w:val="both"/>
-        <w:rPr>
-          <w:rFonts w:ascii="Courier New" w:hAnsi="Courier New" w:cs="Arial"/>
-          <w:b/>
-          <w:i/>
-          <w:sz w:val="20"/>
-          <w:szCs w:val="20"/>
-        </w:rPr>
-      </w:pPr>
-      <w:r>
-        <w:rPr>
-          <w:rFonts w:ascii="Courier New" w:hAnsi="Courier New" w:cs="Arial"/>
-          <w:b/>
-          <w:i/>
-          <w:sz w:val="20"/>
-          <w:szCs w:val="20"/>
-        </w:rPr>
-        <w:t xml:space="preserve">Art. 5. Todos são iguais perante a lei, sem distinção de qualquer natureza, garantindo-se aos brasileiros e aos estrangeiros residentes no País a inviolabilidade do direito à vida, à liberdade, à igualdade, à segurança e à propriedade, nos termos seguintes: </w:t>
-      </w:r>
-    </w:p>
-    <w:p>
-      <w:pPr>
-        <w:spacing w:after="0" w:line="360" w:lineRule="auto"/>
-        <w:ind w:left="1134"/>
-        <w:jc w:val="both"/>
-        <w:rPr>
-          <w:rFonts w:ascii="Courier New" w:hAnsi="Courier New" w:cs="Arial"/>
-          <w:b/>
-          <w:i/>
-          <w:sz w:val="20"/>
-          <w:szCs w:val="20"/>
-        </w:rPr>
-      </w:pPr>
-    </w:p>
-    <w:p>
-      <w:pPr>
-        <w:spacing w:after="0" w:line="360" w:lineRule="auto"/>
-        <w:ind w:left="1134"/>
-        <w:jc w:val="both"/>
-        <w:rPr>
-          <w:rFonts w:ascii="Courier New" w:hAnsi="Courier New" w:cs="Arial"/>
-          <w:b/>
-          <w:i/>
-          <w:sz w:val="20"/>
-          <w:szCs w:val="20"/>
-        </w:rPr>
-      </w:pPr>
-      <w:r>
-        <w:rPr>
-          <w:rFonts w:ascii="Courier New" w:hAnsi="Courier New" w:cs="Arial"/>
-          <w:b/>
-          <w:i/>
-          <w:sz w:val="20"/>
-          <w:szCs w:val="20"/>
-        </w:rPr>
-        <w:t xml:space="preserve">X - são invioláveis a intimidade, a vida privada, a honra e a imagem das pessoas, assegurado o direito a indenização pelo dano material ou moral decorrente de sua violação; </w:t>
-      </w:r>
-    </w:p>
-    <w:p>
-      <w:pPr>
-        <w:spacing w:after="0" w:line="360" w:lineRule="auto"/>
-        <w:ind w:firstLine="2552"/>
-        <w:jc w:val="both"/>
-        <w:rPr>
-          <w:rFonts w:ascii="Arial Narrow" w:hAnsi="Arial Narrow" w:cs="Arial"/>
-          <w:sz w:val="24"/>
-          <w:szCs w:val="24"/>
-        </w:rPr>
-      </w:pPr>
-    </w:p>
-    <w:p>
-      <w:pPr>
-        <w:spacing w:after="0" w:line="360" w:lineRule="auto"/>
-        <w:ind w:firstLine="2552"/>
-        <w:jc w:val="both"/>
-        <w:rPr>
-          <w:rFonts w:ascii="Arial Narrow" w:hAnsi="Arial Narrow" w:cs="Arial"/>
-          <w:sz w:val="24"/>
-          <w:szCs w:val="24"/>
-        </w:rPr>
-      </w:pPr>
-      <w:r>
-        <w:rPr>
-          <w:rFonts w:ascii="Arial Narrow" w:hAnsi="Arial Narrow" w:cs="Arial"/>
-          <w:sz w:val="24"/>
-          <w:szCs w:val="24"/>
-        </w:rPr>
-        <w:t>Não bastando a previsão constitucional, e a garantia proporcionada pela presença no rol das cláusulas pétreas, o direito à imagem também encontra guarida nas normas infraconstitucionais, como o Código Civil e Penal. Aliás, assim dispõe o art. 20 do Código Civil:</w:t>
-      </w:r>
-    </w:p>
-    <w:p>
-      <w:pPr>
-        <w:spacing w:after="0" w:line="360" w:lineRule="auto"/>
-        <w:ind w:firstLine="2552"/>
-        <w:jc w:val="both"/>
-        <w:rPr>
-          <w:rFonts w:ascii="Arial Narrow" w:hAnsi="Arial Narrow" w:cs="Arial"/>
-          <w:sz w:val="24"/>
-          <w:szCs w:val="24"/>
-        </w:rPr>
-      </w:pPr>
-    </w:p>
-    <w:p>
-      <w:pPr>
-        <w:spacing w:after="0" w:line="360" w:lineRule="auto"/>
-        <w:ind w:left="1134"/>
-        <w:jc w:val="both"/>
-        <w:rPr>
-          <w:rFonts w:ascii="Courier New" w:hAnsi="Courier New" w:cs="Arial"/>
-          <w:b/>
-          <w:i/>
-          <w:sz w:val="20"/>
-          <w:szCs w:val="20"/>
-        </w:rPr>
-      </w:pPr>
-      <w:r>
-        <w:rPr>
-          <w:rFonts w:ascii="Courier New" w:hAnsi="Courier New" w:cs="Arial"/>
-          <w:b/>
-          <w:i/>
-          <w:sz w:val="20"/>
-          <w:szCs w:val="20"/>
-        </w:rPr>
-        <w:t xml:space="preserve">Art. 20. Salvo se autorizadas, ou se necessárias à administração da justiça ou à manutenção da ordem pública, a divulgação de escritos, a transmissão da palavra, ou a publicação, a exposição ou a utilização da imagem de uma pessoa poderão ser proibidas, a seu requerimento e sem prejuízo da indenização que couber, se lhe atingirem a honra, a boa fama ou a respeitabilidade, ou se destinarem a fins comerciais. </w:t>
-      </w:r>
-    </w:p>
-    <w:p>
-      <w:pPr>
-        <w:spacing w:after="0" w:line="360" w:lineRule="auto"/>
-        <w:ind w:firstLine="2552"/>
-        <w:jc w:val="both"/>
-        <w:rPr>
-          <w:rFonts w:ascii="Arial Narrow" w:hAnsi="Arial Narrow" w:cs="Arial"/>
-          <w:sz w:val="24"/>
-          <w:szCs w:val="24"/>
-        </w:rPr>
-      </w:pPr>
-    </w:p>
-    <w:p>
-      <w:pPr>
-        <w:spacing w:after="0" w:line="360" w:lineRule="auto"/>
-        <w:ind w:firstLine="2552"/>
-        <w:jc w:val="both"/>
-        <w:rPr>
-          <w:rFonts w:ascii="Arial Narrow" w:hAnsi="Arial Narrow" w:cs="Arial"/>
-          <w:sz w:val="24"/>
-          <w:szCs w:val="24"/>
-        </w:rPr>
-      </w:pPr>
-      <w:r>
-        <w:rPr>
-          <w:rFonts w:ascii="Arial Narrow" w:hAnsi="Arial Narrow" w:cs="Arial"/>
-          <w:sz w:val="24"/>
-          <w:szCs w:val="24"/>
-        </w:rPr>
-        <w:t>O preceptivo legal alhures, não deixa que qualquer dúvida paire sobre o assunto, em total consonância com a Lei Maior.</w:t>
-      </w:r>
-    </w:p>
-    <w:p>
-      <w:pPr>
-        <w:spacing w:after="0" w:line="360" w:lineRule="auto"/>
-        <w:ind w:firstLine="2552"/>
-        <w:jc w:val="both"/>
-        <w:rPr>
-          <w:rFonts w:ascii="Arial Narrow" w:hAnsi="Arial Narrow" w:cs="Arial"/>
-          <w:sz w:val="24"/>
-          <w:szCs w:val="24"/>
-        </w:rPr>
-      </w:pPr>
-    </w:p>
-    <w:p>
-      <w:pPr>
-        <w:spacing w:after="0" w:line="360" w:lineRule="auto"/>
-        <w:ind w:firstLine="2552"/>
-        <w:jc w:val="both"/>
-        <w:rPr>
-          <w:rFonts w:ascii="Arial Narrow" w:hAnsi="Arial Narrow" w:cs="Arial"/>
-          <w:sz w:val="24"/>
-          <w:szCs w:val="24"/>
-        </w:rPr>
-      </w:pPr>
-      <w:r>
-        <w:rPr>
-          <w:rFonts w:ascii="Arial Narrow" w:hAnsi="Arial Narrow" w:cs="Arial"/>
-          <w:sz w:val="24"/>
-          <w:szCs w:val="24"/>
-        </w:rPr>
-        <w:t xml:space="preserve">Está abarcada a imagem, pela proteção constitucional e infraconstitucional, não podendo qualquer pessoa dela se utilizar sem autorização, ainda mais, se for usada para fins comerciais, ou que ataquem a honra, boa fama ou a respeitabilidade. </w:t>
-      </w:r>
-    </w:p>
-    <w:p>
-      <w:pPr>
-        <w:spacing w:after="0" w:line="360" w:lineRule="auto"/>
-        <w:ind w:firstLine="2552"/>
-        <w:jc w:val="both"/>
-        <w:rPr>
-          <w:rFonts w:ascii="Arial Narrow" w:hAnsi="Arial Narrow" w:cs="Arial"/>
-          <w:sz w:val="24"/>
-          <w:szCs w:val="24"/>
-        </w:rPr>
-      </w:pPr>
-    </w:p>
-    <w:p>
-      <w:pPr>
-        <w:spacing w:after="0" w:line="360" w:lineRule="auto"/>
-        <w:ind w:firstLine="2552"/>
-        <w:jc w:val="both"/>
-        <w:rPr>
-          <w:rFonts w:ascii="Arial Narrow" w:hAnsi="Arial Narrow" w:cs="Arial"/>
-          <w:sz w:val="24"/>
-          <w:szCs w:val="24"/>
-        </w:rPr>
-      </w:pPr>
-      <w:r>
-        <w:rPr>
-          <w:rFonts w:ascii="Arial Narrow" w:hAnsi="Arial Narrow" w:cs="Arial"/>
-          <w:sz w:val="24"/>
-          <w:szCs w:val="24"/>
-        </w:rPr>
-        <w:t xml:space="preserve">O uso da imagem para fins comerciais, por si só, já causa dano à pessoa, podendo ensejar a indenização correspondente. </w:t>
-      </w:r>
-    </w:p>
-    <w:p>
-      <w:pPr>
-        <w:spacing w:after="0" w:line="360" w:lineRule="auto"/>
-        <w:ind w:firstLine="2552"/>
-        <w:jc w:val="both"/>
-        <w:rPr>
-          <w:rFonts w:ascii="Arial Narrow" w:hAnsi="Arial Narrow" w:cs="Arial"/>
-          <w:sz w:val="24"/>
-          <w:szCs w:val="24"/>
-        </w:rPr>
-      </w:pPr>
-    </w:p>
-    <w:p>
-      <w:pPr>
-        <w:spacing w:after="0" w:line="360" w:lineRule="auto"/>
-        <w:ind w:firstLine="2552"/>
-        <w:jc w:val="both"/>
-        <w:rPr>
-          <w:rFonts w:ascii="Arial Narrow" w:hAnsi="Arial Narrow" w:cs="Arial"/>
-          <w:sz w:val="24"/>
-          <w:szCs w:val="24"/>
-        </w:rPr>
-      </w:pPr>
-      <w:r>
-        <w:rPr>
-          <w:rFonts w:ascii="Arial Narrow" w:hAnsi="Arial Narrow" w:cs="Arial"/>
-          <w:sz w:val="24"/>
-          <w:szCs w:val="24"/>
-        </w:rPr>
-        <w:t xml:space="preserve">No Direito do Trabalho não é diferente. </w:t>
-      </w:r>
-    </w:p>
-    <w:p>
-      <w:pPr>
-        <w:spacing w:after="0" w:line="360" w:lineRule="auto"/>
-        <w:ind w:firstLine="2552"/>
-        <w:jc w:val="both"/>
-        <w:rPr>
-          <w:rFonts w:ascii="Arial Narrow" w:hAnsi="Arial Narrow" w:cs="Arial"/>
-          <w:sz w:val="24"/>
-          <w:szCs w:val="24"/>
-        </w:rPr>
-      </w:pPr>
-    </w:p>
-    <w:p>
-      <w:pPr>
-        <w:spacing w:after="0" w:line="360" w:lineRule="auto"/>
-        <w:ind w:firstLine="2552"/>
-        <w:jc w:val="both"/>
-        <w:rPr>
-          <w:rFonts w:ascii="Arial Narrow" w:hAnsi="Arial Narrow" w:cs="Arial"/>
-          <w:sz w:val="24"/>
-          <w:szCs w:val="24"/>
-        </w:rPr>
-      </w:pPr>
-      <w:r>
-        <w:rPr>
-          <w:rFonts w:ascii="Arial Narrow" w:hAnsi="Arial Narrow" w:cs="Arial"/>
-          <w:sz w:val="24"/>
-          <w:szCs w:val="24"/>
-        </w:rPr>
-        <w:t>Não pode o empregador utilizar-se da imagem do seu</w:t>
-      </w:r>
-      <w:r>
-        <w:rPr>
-          <w:rFonts w:ascii="Arial Narrow" w:hAnsi="Arial Narrow" w:cs="Arial"/>
-          <w:sz w:val="24"/>
-          <w:szCs w:val="24"/>
-        </w:rPr>
-        <w:t>/sua</w:t>
-      </w:r>
-      <w:r>
-        <w:rPr>
-          <w:rFonts w:ascii="Arial Narrow" w:hAnsi="Arial Narrow" w:cs="Arial"/>
-          <w:sz w:val="24"/>
-          <w:szCs w:val="24"/>
-        </w:rPr>
-        <w:t xml:space="preserve"> empregado</w:t>
-      </w:r>
-      <w:r>
-        <w:rPr>
-          <w:rFonts w:ascii="Arial Narrow" w:hAnsi="Arial Narrow" w:cs="Arial"/>
-          <w:sz w:val="24"/>
-          <w:szCs w:val="24"/>
-        </w:rPr>
-        <w:t xml:space="preserve"> (a)</w:t>
-      </w:r>
-      <w:r>
-        <w:rPr>
-          <w:rFonts w:ascii="Arial Narrow" w:hAnsi="Arial Narrow" w:cs="Arial"/>
-          <w:sz w:val="24"/>
-          <w:szCs w:val="24"/>
-        </w:rPr>
-        <w:t xml:space="preserve"> para promover sua empresa, seu produto ou qualquer outro objeto de cunho comercial sem a expressa anuência daquele. Ao utilizar a imagem do empregado, o empregador deve fornecer meios que viabilizem a correspondente contraprestação pecuniária, não ficando o primeiro prejudicado, bem com o segundo desprotegido. </w:t>
-      </w:r>
-    </w:p>
-    <w:p>
-      <w:pPr>
-        <w:spacing w:after="0" w:line="360" w:lineRule="auto"/>
-        <w:ind w:firstLine="2552"/>
-        <w:jc w:val="both"/>
-        <w:rPr>
-          <w:rFonts w:ascii="Arial Narrow" w:hAnsi="Arial Narrow" w:cs="Arial"/>
-          <w:sz w:val="24"/>
-          <w:szCs w:val="24"/>
-        </w:rPr>
-      </w:pPr>
-    </w:p>
-    <w:p>
-      <w:pPr>
-        <w:spacing w:after="0" w:line="360" w:lineRule="auto"/>
-        <w:ind w:firstLine="2552"/>
-        <w:jc w:val="both"/>
-        <w:rPr>
-          <w:rFonts w:ascii="Arial Narrow" w:hAnsi="Arial Narrow" w:cs="Arial"/>
-          <w:sz w:val="24"/>
-          <w:szCs w:val="24"/>
-        </w:rPr>
-      </w:pPr>
-      <w:r>
-        <w:rPr>
-          <w:rFonts w:ascii="Arial Narrow" w:hAnsi="Arial Narrow" w:cs="Arial"/>
-          <w:sz w:val="24"/>
-          <w:szCs w:val="24"/>
-        </w:rPr>
-        <w:t>Se o empregador almejasse uma propaganda de seu estabelecimento, ou de seu produto, e que uma pessoa figurasse em tal exposição, teria logicamente que contratar uma pessoa “modelo”, e estaria desta forma obrigado a arcar com seus gastos. É esta a linha que deve nortear a utilização da imagem do empregado como propaganda da empresa, produto ou serviço do empregador, sob pena deste se ver locupletando em prejuízo daquele.</w:t>
-      </w:r>
-    </w:p>
-    <w:p>
-      <w:pPr>
-        <w:spacing w:after="0" w:line="360" w:lineRule="auto"/>
-        <w:ind w:firstLine="2552"/>
-        <w:jc w:val="both"/>
-        <w:rPr>
-          <w:rFonts w:ascii="Arial Narrow" w:hAnsi="Arial Narrow" w:cs="Arial"/>
-          <w:sz w:val="24"/>
-          <w:szCs w:val="24"/>
-        </w:rPr>
-      </w:pPr>
-    </w:p>
-    <w:p>
-      <w:pPr>
-        <w:spacing w:after="0" w:line="360" w:lineRule="auto"/>
-        <w:ind w:firstLine="2552"/>
-        <w:jc w:val="both"/>
-        <w:rPr>
-          <w:rFonts w:ascii="Arial Narrow" w:hAnsi="Arial Narrow" w:cs="Arial"/>
-          <w:sz w:val="24"/>
-          <w:szCs w:val="24"/>
-        </w:rPr>
-      </w:pPr>
-      <w:r>
-        <w:rPr>
-          <w:rFonts w:ascii="Arial Narrow" w:hAnsi="Arial Narrow" w:cs="Arial"/>
-          <w:sz w:val="24"/>
-          <w:szCs w:val="24"/>
-        </w:rPr>
-        <w:t>Leciona Maria Helena Diniz, no sentido de que a utilização da imagem de uma pessoa, sem o seu consentimento, causa uma lesão a um interesse que visa a satisfação ou gozo de um bem jurídico extra patrimonial contido nos direitos da personalidade (.</w:t>
-      </w:r>
-      <w:r>
-        <w:rPr>
-          <w:rFonts w:ascii="Arial Narrow" w:hAnsi="Arial Narrow" w:cs="Arial"/>
-          <w:sz w:val="24"/>
-          <w:szCs w:val="24"/>
-        </w:rPr>
-        <w:t>..) ou nos atributos da pessoa</w:t>
-      </w:r>
-      <w:r>
-        <w:rPr>
-          <w:rFonts w:ascii="Arial Narrow" w:hAnsi="Arial Narrow" w:cs="Arial"/>
-          <w:sz w:val="24"/>
-          <w:szCs w:val="24"/>
-        </w:rPr>
-        <w:t>.</w:t>
+          <w:bCs/>
+          <w:sz w:val="24"/>
+          <w:szCs w:val="24"/>
+        </w:rPr>
+        <w:t xml:space="preserve">, da imposição psicológica daquele que é mais forte na relação contratual para o aceite de condição desfavorável ao empregado. </w:t>
+      </w:r>
+    </w:p>
+    <w:p>
+      <w:pPr>
+        <w:spacing w:after="0" w:line="360" w:lineRule="auto"/>
+        <w:jc w:val="both"/>
+        <w:rPr>
+          <w:rFonts w:ascii="Arial Narrow" w:hAnsi="Arial Narrow" w:cs="Arial"/>
+          <w:b/>
+          <w:bCs/>
+          <w:i/>
+          <w:sz w:val="24"/>
+          <w:szCs w:val="24"/>
+        </w:rPr>
+      </w:pPr>
+    </w:p>
+    <w:p>
+      <w:pPr>
+        <w:pStyle w:val="Recuodecorpodetexto3"/>
+        <w:spacing w:line="360" w:lineRule="auto"/>
+        <w:ind w:firstLine="2552"/>
+        <w:rPr>
+          <w:rFonts w:ascii="Arial Narrow" w:hAnsi="Arial Narrow" w:cs="Arial"/>
+        </w:rPr>
+      </w:pPr>
+      <w:r>
+        <w:rPr>
+          <w:rFonts w:ascii="Arial Narrow" w:hAnsi="Arial Narrow" w:cs="Arial"/>
+          <w:i/>
+        </w:rPr>
+        <w:t xml:space="preserve">In </w:t>
+      </w:r>
+      <w:proofErr w:type="spellStart"/>
+      <w:r>
+        <w:rPr>
+          <w:rFonts w:ascii="Arial Narrow" w:hAnsi="Arial Narrow" w:cs="Arial"/>
+          <w:i/>
+        </w:rPr>
+        <w:t>casu</w:t>
+      </w:r>
+      <w:proofErr w:type="spellEnd"/>
+      <w:r>
+        <w:rPr>
+          <w:rFonts w:ascii="Arial Narrow" w:hAnsi="Arial Narrow" w:cs="Arial"/>
+        </w:rPr>
+        <w:t xml:space="preserve">, </w:t>
+      </w:r>
+      <w:r>
+        <w:rPr>
+          <w:rFonts w:ascii="Arial Narrow" w:hAnsi="Arial Narrow" w:cs="Arial"/>
+        </w:rPr>
+        <w:t>o</w:t>
+      </w:r>
+      <w:r>
+        <w:rPr>
+          <w:rFonts w:ascii="Arial Narrow" w:hAnsi="Arial Narrow" w:cs="Arial"/>
+        </w:rPr>
+        <w:t xml:space="preserve"> ambiente de trabalho </w:t>
+      </w:r>
+      <w:r>
+        <w:rPr>
+          <w:rFonts w:ascii="Arial Narrow" w:hAnsi="Arial Narrow" w:cs="Arial"/>
+        </w:rPr>
+        <w:t xml:space="preserve">tornou-se </w:t>
+      </w:r>
+      <w:r>
+        <w:rPr>
+          <w:rFonts w:ascii="Arial Narrow" w:hAnsi="Arial Narrow" w:cs="Arial"/>
+        </w:rPr>
+        <w:t>insuportável, causando</w:t>
+      </w:r>
+      <w:r>
+        <w:rPr>
+          <w:rFonts w:ascii="Arial Narrow" w:hAnsi="Arial Narrow" w:cs="Arial"/>
+        </w:rPr>
+        <w:t xml:space="preserve"> à parte Autora</w:t>
+      </w:r>
+      <w:r>
+        <w:rPr>
+          <w:rFonts w:ascii="Arial Narrow" w:hAnsi="Arial Narrow" w:cs="Arial"/>
+        </w:rPr>
+        <w:t>, inclusive, o adoecimento mental. O tratamento é degradante e afronta as mais comezinhas normas, não apenas ligadas a proteção do empregado, mas também aos direitos individuais constitucionalmente garantidos, albergados ao nosso plexo jurídico após anos infindáveis onde a discriminação reinava absoluta.</w:t>
+      </w:r>
+    </w:p>
+    <w:p>
+      <w:pPr>
+        <w:pStyle w:val="Recuodecorpodetexto3"/>
+        <w:spacing w:line="360" w:lineRule="auto"/>
+        <w:ind w:firstLine="2552"/>
+        <w:rPr>
+          <w:rFonts w:ascii="Arial Narrow" w:hAnsi="Arial Narrow" w:cs="Arial"/>
+        </w:rPr>
+      </w:pPr>
+    </w:p>
+    <w:p>
+      <w:pPr>
+        <w:spacing w:after="0" w:line="360" w:lineRule="auto"/>
+        <w:ind w:firstLine="2552"/>
+        <w:jc w:val="both"/>
+        <w:rPr>
+          <w:rFonts w:ascii="Arial Narrow" w:hAnsi="Arial Narrow" w:cs="Arial"/>
+          <w:bCs/>
+          <w:sz w:val="24"/>
+          <w:szCs w:val="24"/>
+        </w:rPr>
+      </w:pPr>
+      <w:r>
+        <w:rPr>
+          <w:rFonts w:ascii="Arial Narrow" w:hAnsi="Arial Narrow" w:cs="Arial"/>
+          <w:bCs/>
+          <w:sz w:val="24"/>
+          <w:szCs w:val="24"/>
+        </w:rPr>
+        <w:t>A psiquiatra francesa Marie-France Hirigoyen entende o assédio moral como sendo qualquer conduta abusiva, configurada através de gestos, palavras, comportamentos inadequados e atitudes que fogem do que é comumente aceito pela sociedade. Essa conduta abusiva, em razão de sua repetição ou sistematização, atenta contra a personalidade, dignidade ou integridade psíquica ou física de uma pessoa, ameaçando seu emprego ou degradando o ambiente de trabalho.</w:t>
       </w:r>
       <w:r>
         <w:rPr>
           <w:rStyle w:val="Refdenotaderodap"/>
           <w:rFonts w:ascii="Arial Narrow" w:hAnsi="Arial Narrow"/>
-          <w:sz w:val="24"/>
-          <w:szCs w:val="24"/>
-        </w:rPr>
-        <w:footnoteReference w:id="21"/>
-      </w:r>
-    </w:p>
-    <w:p>
-      <w:pPr>
-        <w:spacing w:after="0" w:line="360" w:lineRule="auto"/>
-        <w:ind w:firstLine="2552"/>
-        <w:jc w:val="both"/>
-        <w:rPr>
-          <w:rFonts w:ascii="Arial Narrow" w:hAnsi="Arial Narrow" w:cs="Arial"/>
-          <w:sz w:val="24"/>
-          <w:szCs w:val="24"/>
-        </w:rPr>
-      </w:pPr>
-    </w:p>
-    <w:p>
-      <w:pPr>
-        <w:spacing w:after="0" w:line="360" w:lineRule="auto"/>
-        <w:ind w:firstLine="2552"/>
-        <w:jc w:val="both"/>
-        <w:rPr>
-          <w:rFonts w:ascii="Arial Narrow" w:hAnsi="Arial Narrow" w:cs="Arial"/>
-          <w:sz w:val="24"/>
-          <w:szCs w:val="24"/>
-        </w:rPr>
-      </w:pPr>
-      <w:r>
-        <w:rPr>
-          <w:rFonts w:ascii="Arial Narrow" w:hAnsi="Arial Narrow" w:cs="Arial"/>
-          <w:sz w:val="24"/>
-          <w:szCs w:val="24"/>
-        </w:rPr>
-        <w:t xml:space="preserve">Percebesse que não é necessário que haja qualquer tipo de sofrimento à pessoa qual teve sua imagem utilizada, sendo o efetivo emprego desta para que ocorra a violação ao direito, e conseqüentemente ocasione a lesão. </w:t>
-      </w:r>
-    </w:p>
-    <w:p>
-      <w:pPr>
-        <w:spacing w:after="0" w:line="360" w:lineRule="auto"/>
-        <w:ind w:firstLine="2552"/>
-        <w:jc w:val="both"/>
-        <w:rPr>
-          <w:rFonts w:ascii="Arial Narrow" w:hAnsi="Arial Narrow" w:cs="Arial"/>
-          <w:sz w:val="24"/>
-          <w:szCs w:val="24"/>
-        </w:rPr>
-      </w:pPr>
-    </w:p>
-    <w:p>
-      <w:pPr>
-        <w:spacing w:after="0" w:line="360" w:lineRule="auto"/>
-        <w:ind w:firstLine="2552"/>
-        <w:jc w:val="both"/>
-        <w:rPr>
-          <w:rFonts w:ascii="Arial Narrow" w:hAnsi="Arial Narrow" w:cs="Arial"/>
-          <w:sz w:val="24"/>
-          <w:szCs w:val="24"/>
-        </w:rPr>
-      </w:pPr>
-      <w:r>
-        <w:rPr>
-          <w:rFonts w:ascii="Arial Narrow" w:hAnsi="Arial Narrow" w:cs="Arial"/>
-          <w:sz w:val="24"/>
-          <w:szCs w:val="24"/>
-        </w:rPr>
-        <w:t xml:space="preserve">Nossos Tribunais já vem se posicionando neste sentido, senão vejamos: </w:t>
-      </w:r>
-    </w:p>
-    <w:p>
-      <w:pPr>
-        <w:spacing w:after="0" w:line="360" w:lineRule="auto"/>
-        <w:ind w:firstLine="2552"/>
-        <w:jc w:val="both"/>
-        <w:rPr>
-          <w:rFonts w:ascii="Arial Narrow" w:hAnsi="Arial Narrow" w:cs="Arial"/>
-          <w:sz w:val="24"/>
-          <w:szCs w:val="24"/>
-        </w:rPr>
-      </w:pPr>
-    </w:p>
-    <w:p>
-      <w:pPr>
-        <w:spacing w:after="0" w:line="360" w:lineRule="auto"/>
-        <w:ind w:left="1134"/>
-        <w:jc w:val="both"/>
-        <w:rPr>
-          <w:rFonts w:ascii="Courier New" w:hAnsi="Courier New" w:cs="Arial"/>
-          <w:b/>
-          <w:i/>
-          <w:sz w:val="20"/>
-          <w:szCs w:val="20"/>
-        </w:rPr>
-      </w:pPr>
-      <w:r>
-        <w:rPr>
-          <w:rFonts w:ascii="Courier New" w:hAnsi="Courier New" w:cs="Arial"/>
-          <w:b/>
-          <w:i/>
-          <w:sz w:val="20"/>
-          <w:szCs w:val="20"/>
-        </w:rPr>
-        <w:t xml:space="preserve">DIREITO DE IMAGEM - USO INDEVIDO PARA FINS COMERCIAIS SEM AUTORIZAÇÃO DA FOTOGRAFADA. Ainda que o uso da imagem não traga danificação à personalidade e a integridade moral da pessoa, a inviolabilidade da intimidade da vida privada, representada pela publicação de fotografia com fins comerciais, sem autorização do fotografado, caracteriza-se como locupletamento ilícito à custa de outrem, o que importa em indenização por reparação ao dano causado. Inteligência dos artigos 5º, inciso X da Constituição Federal da República, c/c. os artigos 18, 20 e 186 do Novo Código Civil Brasileiro. RECURSO IMPROVIDO”. </w:t>
-      </w:r>
-    </w:p>
-    <w:p>
-      <w:pPr>
-        <w:spacing w:after="0" w:line="360" w:lineRule="auto"/>
-        <w:ind w:firstLine="2552"/>
-        <w:jc w:val="both"/>
-        <w:rPr>
-          <w:rFonts w:ascii="Arial Narrow" w:hAnsi="Arial Narrow" w:cs="Arial"/>
-          <w:sz w:val="24"/>
-          <w:szCs w:val="24"/>
-        </w:rPr>
-      </w:pPr>
-    </w:p>
-    <w:p>
-      <w:pPr>
-        <w:spacing w:after="0" w:line="360" w:lineRule="auto"/>
-        <w:ind w:firstLine="2552"/>
-        <w:jc w:val="both"/>
-        <w:rPr>
-          <w:rFonts w:ascii="Arial Narrow" w:hAnsi="Arial Narrow" w:cs="Arial"/>
-          <w:sz w:val="24"/>
-          <w:szCs w:val="24"/>
-        </w:rPr>
-      </w:pPr>
-      <w:r>
-        <w:rPr>
-          <w:rFonts w:ascii="Arial Narrow" w:hAnsi="Arial Narrow" w:cs="Arial"/>
-          <w:sz w:val="24"/>
-          <w:szCs w:val="24"/>
-        </w:rPr>
-        <w:t xml:space="preserve">E ainda: </w:t>
-      </w:r>
-    </w:p>
-    <w:p>
-      <w:pPr>
-        <w:spacing w:after="0" w:line="360" w:lineRule="auto"/>
-        <w:ind w:firstLine="2552"/>
-        <w:jc w:val="both"/>
-        <w:rPr>
-          <w:rFonts w:ascii="Arial Narrow" w:hAnsi="Arial Narrow" w:cs="Arial"/>
-          <w:sz w:val="24"/>
-          <w:szCs w:val="24"/>
-        </w:rPr>
-      </w:pPr>
-    </w:p>
-    <w:p>
-      <w:pPr>
-        <w:spacing w:after="0" w:line="360" w:lineRule="auto"/>
-        <w:ind w:left="1134"/>
-        <w:jc w:val="both"/>
-        <w:rPr>
-          <w:rFonts w:ascii="Courier New" w:hAnsi="Courier New" w:cs="Arial"/>
-          <w:b/>
-          <w:i/>
-          <w:sz w:val="20"/>
-          <w:szCs w:val="20"/>
-        </w:rPr>
-      </w:pPr>
-      <w:r>
-        <w:rPr>
-          <w:rFonts w:ascii="Courier New" w:hAnsi="Courier New" w:cs="Arial"/>
-          <w:b/>
-          <w:i/>
-          <w:sz w:val="20"/>
-          <w:szCs w:val="20"/>
-        </w:rPr>
-        <w:t>DANO MORAL. USO COMERCIAL E NÃO AUTORIZADO DA IMAGEM DO EMPREGADO. PROCEDÊNCIA. Nos termos do artigo 5º, X, da Constituição Federal e do artigo 20 do Código Civil, o uso comercial e não autorizado da imagem do empregado deve ser indenizado. O uso da imagem não se insere nas atividades normais do trabalhador, fugindo à regra do artigo 456 da CLT. Além disso, não é exigível do empregado que se oponha ao fato no curso do contrato de trabalho, uma vez que tal atitude poderia inviabilizar sua permanência no emprego. Recurso do reclamante provido.</w:t>
-      </w:r>
-      <w:r>
-        <w:rPr>
-          <w:rStyle w:val="Refdenotaderodap"/>
-          <w:rFonts w:ascii="Courier New" w:hAnsi="Courier New"/>
-          <w:b/>
-          <w:i/>
-          <w:sz w:val="20"/>
-          <w:szCs w:val="20"/>
-        </w:rPr>
-        <w:footnoteReference w:id="22"/>
-      </w:r>
-    </w:p>
-    <w:p>
-      <w:pPr>
-        <w:spacing w:after="0" w:line="360" w:lineRule="auto"/>
-        <w:ind w:firstLine="2552"/>
-        <w:jc w:val="both"/>
-        <w:rPr>
-          <w:rFonts w:ascii="Arial Narrow" w:hAnsi="Arial Narrow" w:cs="Arial"/>
-          <w:sz w:val="24"/>
-          <w:szCs w:val="24"/>
-        </w:rPr>
-      </w:pPr>
-    </w:p>
-    <w:p>
-      <w:pPr>
-        <w:spacing w:after="0" w:line="360" w:lineRule="auto"/>
-        <w:ind w:firstLine="2552"/>
-        <w:jc w:val="both"/>
-        <w:rPr>
-          <w:rFonts w:ascii="Arial Narrow" w:hAnsi="Arial Narrow" w:cs="Arial"/>
-          <w:sz w:val="24"/>
-          <w:szCs w:val="24"/>
-        </w:rPr>
-      </w:pPr>
-      <w:r>
-        <w:rPr>
-          <w:rFonts w:ascii="Arial Narrow" w:hAnsi="Arial Narrow" w:cs="Arial"/>
-          <w:sz w:val="24"/>
-          <w:szCs w:val="24"/>
-        </w:rPr>
-        <w:t>A evolução do tema na seara trabalhista foi tamanha, que durante a 1ª Jornada de Direito Material e Processual do Trabalho, restou assentado no enunciado 14:</w:t>
-      </w:r>
-    </w:p>
-    <w:p>
-      <w:pPr>
-        <w:spacing w:after="0" w:line="360" w:lineRule="auto"/>
-        <w:ind w:firstLine="2552"/>
-        <w:jc w:val="both"/>
-        <w:rPr>
-          <w:rFonts w:ascii="Arial Narrow" w:hAnsi="Arial Narrow" w:cs="Arial"/>
-          <w:sz w:val="24"/>
-          <w:szCs w:val="24"/>
-        </w:rPr>
-      </w:pPr>
-    </w:p>
-    <w:p>
-      <w:pPr>
-        <w:spacing w:after="0" w:line="360" w:lineRule="auto"/>
-        <w:ind w:left="1134"/>
-        <w:jc w:val="both"/>
-        <w:rPr>
-          <w:rFonts w:ascii="Courier New" w:hAnsi="Courier New" w:cs="Arial"/>
-          <w:b/>
-          <w:i/>
-          <w:sz w:val="20"/>
-          <w:szCs w:val="20"/>
-        </w:rPr>
-      </w:pPr>
-      <w:r>
-        <w:rPr>
-          <w:rFonts w:ascii="Courier New" w:hAnsi="Courier New" w:cs="Arial"/>
-          <w:b/>
-          <w:i/>
-          <w:sz w:val="20"/>
-          <w:szCs w:val="20"/>
-        </w:rPr>
-        <w:t>Enunciado 14. IMAGEM DO TRABALHADOR. UTILIZAÇÃO PELO EMPREGADOR. LIMITES. São vedadas ao empregador, sem autorização judicial, a conservação de gravação, a exibição e a divulgação, para seu uso privado, de imagens dos trabalhadores antes, no curso ou logo após a sua jornada de trabalho, por violação ao direito de imagem e à preservação das expressões da personalidade, garantidos pelo art. 5º, V, da Constituição. A formação do contrato de emprego, por si só, não importa em cessão do direito de imagem e da divulgação fora de eu objeto da expressão da personalidade do trabalhador, nem o só pagamento do salário e demais títulos trabalhistas os remunera.</w:t>
-      </w:r>
-    </w:p>
-    <w:p>
-      <w:pPr>
-        <w:spacing w:after="0" w:line="360" w:lineRule="auto"/>
-        <w:ind w:firstLine="2552"/>
-        <w:jc w:val="both"/>
-        <w:rPr>
-          <w:rFonts w:ascii="Arial Narrow" w:hAnsi="Arial Narrow" w:cs="Arial"/>
-          <w:sz w:val="24"/>
-          <w:szCs w:val="24"/>
-        </w:rPr>
-      </w:pPr>
-    </w:p>
-    <w:p>
-      <w:pPr>
-        <w:spacing w:after="0" w:line="360" w:lineRule="auto"/>
-        <w:ind w:firstLine="2552"/>
-        <w:jc w:val="both"/>
-        <w:rPr>
-          <w:rFonts w:ascii="Arial Narrow" w:hAnsi="Arial Narrow" w:cs="Arial"/>
-          <w:sz w:val="24"/>
-          <w:szCs w:val="24"/>
-        </w:rPr>
-      </w:pPr>
-      <w:r>
-        <w:rPr>
-          <w:rFonts w:ascii="Arial Narrow" w:hAnsi="Arial Narrow" w:cs="Arial"/>
-          <w:sz w:val="24"/>
-          <w:szCs w:val="24"/>
-        </w:rPr>
-        <w:t xml:space="preserve">Não se pode admitir, por outro lado, que o uso da imagem do empregado pelo seu empregador esteja incluído no contrato de trabalho. </w:t>
-      </w:r>
-    </w:p>
-    <w:p>
-      <w:pPr>
-        <w:spacing w:after="0" w:line="360" w:lineRule="auto"/>
-        <w:ind w:firstLine="2552"/>
-        <w:jc w:val="both"/>
-        <w:rPr>
-          <w:rFonts w:ascii="Arial Narrow" w:hAnsi="Arial Narrow" w:cs="Arial"/>
-          <w:sz w:val="24"/>
-          <w:szCs w:val="24"/>
-        </w:rPr>
-      </w:pPr>
-      <w:r>
-        <w:rPr>
-          <w:rFonts w:ascii="Arial Narrow" w:hAnsi="Arial Narrow" w:cs="Arial"/>
-          <w:sz w:val="24"/>
-          <w:szCs w:val="24"/>
-        </w:rPr>
-        <w:t xml:space="preserve">Se o empregado não presta serviços de modelo fotográfico, fica impossível aceitar a idéia que o uso de sua imagem esteja incluída dentro dos termos de prestação de labor, salvo a existência de cláusula específica tratando do assunto, o que se pode dizer, não é usual. </w:t>
-      </w:r>
-    </w:p>
-    <w:p>
-      <w:pPr>
-        <w:spacing w:after="0" w:line="360" w:lineRule="auto"/>
-        <w:ind w:firstLine="2552"/>
-        <w:jc w:val="both"/>
-        <w:rPr>
-          <w:rFonts w:ascii="Arial Narrow" w:hAnsi="Arial Narrow" w:cs="Arial"/>
-          <w:sz w:val="24"/>
-          <w:szCs w:val="24"/>
-        </w:rPr>
-      </w:pPr>
-    </w:p>
-    <w:p>
-      <w:pPr>
-        <w:spacing w:after="0" w:line="360" w:lineRule="auto"/>
-        <w:ind w:firstLine="2552"/>
-        <w:jc w:val="both"/>
-        <w:rPr>
-          <w:rFonts w:ascii="Arial Narrow" w:hAnsi="Arial Narrow" w:cs="Arial"/>
-          <w:sz w:val="24"/>
-          <w:szCs w:val="24"/>
-        </w:rPr>
-      </w:pPr>
-      <w:r>
-        <w:rPr>
-          <w:rFonts w:ascii="Arial Narrow" w:hAnsi="Arial Narrow" w:cs="Arial"/>
-          <w:sz w:val="24"/>
-          <w:szCs w:val="24"/>
-        </w:rPr>
-        <w:t xml:space="preserve">Portanto, o uso da imagem pode ser ajustado expressamente ao contrato de trabalho, mas não flui originariamente deste quando não estiver presente, sob pena de locupletamento do empregador. No que se refere à anuência tácita, pode-se argumentar, ser tese muito combatida pelos empregadores, mas infelizmente não pode prosperar em desfavor inquestionável dos empregados. </w:t>
-      </w:r>
-    </w:p>
-    <w:p>
-      <w:pPr>
-        <w:spacing w:after="0" w:line="360" w:lineRule="auto"/>
-        <w:ind w:firstLine="2552"/>
-        <w:jc w:val="both"/>
-        <w:rPr>
-          <w:rFonts w:ascii="Arial Narrow" w:hAnsi="Arial Narrow" w:cs="Arial"/>
-          <w:sz w:val="24"/>
-          <w:szCs w:val="24"/>
-        </w:rPr>
-      </w:pPr>
-    </w:p>
-    <w:p>
-      <w:pPr>
-        <w:spacing w:after="0" w:line="360" w:lineRule="auto"/>
-        <w:ind w:firstLine="2552"/>
-        <w:jc w:val="both"/>
-        <w:rPr>
-          <w:rFonts w:ascii="Arial Narrow" w:hAnsi="Arial Narrow" w:cs="Arial"/>
-          <w:sz w:val="24"/>
-          <w:szCs w:val="24"/>
-        </w:rPr>
-      </w:pPr>
-      <w:r>
-        <w:rPr>
-          <w:rFonts w:ascii="Arial Narrow" w:hAnsi="Arial Narrow" w:cs="Arial"/>
-          <w:sz w:val="24"/>
-          <w:szCs w:val="24"/>
-        </w:rPr>
-        <w:t xml:space="preserve">O trabalhador em sua condição de dependência se sente obrigado a cumprir todas as exigências impostas pelo empregador, sabendo que se com este se indispor estará correndo sérios riscos com a manutenção de seu labor, e por este motivo, é que não se pode empregar a anuência tácita para o caso. Ciente disso, se a empresa entender por bem utilizar a imagem de determinado empregado para fazer propagandas de seu produto ou estabelecimento, sem que para tanto tenha proporcionado a aquele qualquer remuneração, poderá ser condenada a indenizar. </w:t>
-      </w:r>
-    </w:p>
-    <w:p>
-      <w:pPr>
-        <w:spacing w:after="0" w:line="360" w:lineRule="auto"/>
-        <w:ind w:firstLine="2552"/>
-        <w:jc w:val="both"/>
-        <w:rPr>
-          <w:rFonts w:ascii="Arial Narrow" w:hAnsi="Arial Narrow" w:cs="Arial"/>
-          <w:sz w:val="24"/>
-          <w:szCs w:val="24"/>
-        </w:rPr>
-      </w:pPr>
-    </w:p>
-    <w:p>
-      <w:pPr>
-        <w:spacing w:after="0" w:line="360" w:lineRule="auto"/>
-        <w:ind w:firstLine="2552"/>
-        <w:jc w:val="both"/>
-        <w:rPr>
-          <w:rFonts w:ascii="Arial Narrow" w:hAnsi="Arial Narrow" w:cs="Arial"/>
-          <w:sz w:val="24"/>
-          <w:szCs w:val="24"/>
-        </w:rPr>
-      </w:pPr>
-      <w:r>
-        <w:rPr>
-          <w:rFonts w:ascii="Arial Narrow" w:hAnsi="Arial Narrow" w:cs="Arial"/>
-          <w:sz w:val="24"/>
-          <w:szCs w:val="24"/>
-        </w:rPr>
-        <w:t>Seguindo a mesma tese, Carlos Alberto Bittar</w:t>
-      </w:r>
-      <w:r>
-        <w:rPr>
-          <w:rFonts w:ascii="Arial Narrow" w:hAnsi="Arial Narrow" w:cs="Arial"/>
-          <w:sz w:val="24"/>
-          <w:szCs w:val="24"/>
-        </w:rPr>
-        <w:t xml:space="preserve"> admoesta</w:t>
-      </w:r>
-      <w:r>
-        <w:rPr>
-          <w:rFonts w:ascii="Arial Narrow" w:hAnsi="Arial Narrow" w:cs="Arial"/>
-          <w:sz w:val="24"/>
-          <w:szCs w:val="24"/>
-        </w:rPr>
-        <w:t xml:space="preserve">: </w:t>
-      </w:r>
-    </w:p>
-    <w:p>
-      <w:pPr>
-        <w:spacing w:after="0" w:line="360" w:lineRule="auto"/>
-        <w:ind w:firstLine="2552"/>
-        <w:jc w:val="both"/>
-        <w:rPr>
-          <w:rFonts w:ascii="Arial Narrow" w:hAnsi="Arial Narrow" w:cs="Arial"/>
-          <w:sz w:val="24"/>
-          <w:szCs w:val="24"/>
-        </w:rPr>
-      </w:pPr>
-    </w:p>
-    <w:p>
-      <w:pPr>
-        <w:spacing w:after="0" w:line="360" w:lineRule="auto"/>
-        <w:ind w:left="1134"/>
-        <w:jc w:val="both"/>
-        <w:rPr>
-          <w:rFonts w:ascii="Courier New" w:hAnsi="Courier New" w:cs="Arial"/>
-          <w:b/>
-          <w:i/>
-          <w:sz w:val="20"/>
-          <w:szCs w:val="20"/>
-        </w:rPr>
-      </w:pPr>
-      <w:r>
-        <w:rPr>
-          <w:rFonts w:ascii="Courier New" w:hAnsi="Courier New" w:cs="Arial"/>
-          <w:b/>
-          <w:i/>
-          <w:sz w:val="20"/>
-          <w:szCs w:val="20"/>
-        </w:rPr>
-        <w:t>“de bom alvitre analisar-se, primeiro, a) a repercussão na esfera de lesado, depois, b) o potencial econômico-social de lesante e c) as circunstâncias do caso, para finalmente se definir o valor da indenização, alcançando-se, assim, os resultados próprios: compensação a um e sancionamento a outro”.</w:t>
-      </w:r>
-      <w:r>
-        <w:rPr>
-          <w:rStyle w:val="Refdenotaderodap"/>
-          <w:rFonts w:ascii="Courier New" w:hAnsi="Courier New"/>
-          <w:b/>
-          <w:i/>
-          <w:sz w:val="20"/>
-          <w:szCs w:val="20"/>
-        </w:rPr>
-        <w:footnoteReference w:id="23"/>
-      </w:r>
-    </w:p>
-    <w:p>
-      <w:pPr>
-        <w:spacing w:after="0" w:line="360" w:lineRule="auto"/>
-        <w:ind w:firstLine="2552"/>
-        <w:jc w:val="both"/>
-        <w:rPr>
-          <w:rFonts w:ascii="Arial Narrow" w:hAnsi="Arial Narrow" w:cs="Arial"/>
-          <w:sz w:val="24"/>
-          <w:szCs w:val="24"/>
-        </w:rPr>
-      </w:pPr>
-    </w:p>
-    <w:p>
-      <w:pPr>
-        <w:spacing w:after="0" w:line="360" w:lineRule="auto"/>
-        <w:ind w:firstLine="2552"/>
-        <w:jc w:val="both"/>
-        <w:rPr>
-          <w:rFonts w:ascii="Arial Narrow" w:hAnsi="Arial Narrow" w:cs="Arial"/>
-          <w:sz w:val="24"/>
-          <w:szCs w:val="24"/>
-        </w:rPr>
-      </w:pPr>
-      <w:r>
-        <w:rPr>
-          <w:rFonts w:ascii="Arial Narrow" w:hAnsi="Arial Narrow" w:cs="Arial"/>
-          <w:sz w:val="24"/>
-          <w:szCs w:val="24"/>
-        </w:rPr>
-        <w:t>Nesta esteira, se a empresa não se vê obrigada a pagar uma quantia justa pelo dano que causou, num importe que a faça perceber que não vale a pena cometê-lo novamente, ou se o fizer, deverá orientar-se pela devida remuneração com a anuência da pessoa da qual vai se utilizar a imagem, não estará esta indenização atingindo o fim visado com a sua imposição.</w:t>
-      </w:r>
-      <w:r>
-        <w:rPr>
-          <w:rFonts w:ascii="Arial Narrow" w:hAnsi="Arial Narrow" w:cs="Arial"/>
+          <w:bCs/>
+          <w:sz w:val="24"/>
+          <w:szCs w:val="24"/>
+        </w:rPr>
+        <w:footnoteReference w:id="26"/>
+      </w:r>
+    </w:p>
+    <w:p>
+      <w:pPr>
+        <w:spacing w:after="0" w:line="360" w:lineRule="auto"/>
+        <w:ind w:firstLine="2552"/>
+        <w:jc w:val="both"/>
+        <w:rPr>
+          <w:rFonts w:ascii="Arial Narrow" w:hAnsi="Arial Narrow" w:cs="Arial"/>
+          <w:bCs/>
+          <w:sz w:val="24"/>
+          <w:szCs w:val="24"/>
+        </w:rPr>
+      </w:pPr>
+    </w:p>
+    <w:p>
+      <w:pPr>
+        <w:spacing w:after="0" w:line="360" w:lineRule="auto"/>
+        <w:ind w:firstLine="2552"/>
+        <w:jc w:val="both"/>
+        <w:rPr>
+          <w:rFonts w:ascii="Arial Narrow" w:hAnsi="Arial Narrow" w:cs="Arial"/>
+          <w:bCs/>
+          <w:sz w:val="24"/>
+          <w:szCs w:val="24"/>
+        </w:rPr>
+      </w:pPr>
+      <w:r>
+        <w:rPr>
+          <w:rFonts w:ascii="Arial Narrow" w:hAnsi="Arial Narrow" w:cs="Arial"/>
+          <w:bCs/>
+          <w:sz w:val="24"/>
+          <w:szCs w:val="24"/>
+        </w:rPr>
+        <w:t xml:space="preserve">No mesmo sentido, Mauro </w:t>
+      </w:r>
+      <w:proofErr w:type="spellStart"/>
+      <w:r>
+        <w:rPr>
+          <w:rFonts w:ascii="Arial Narrow" w:hAnsi="Arial Narrow" w:cs="Arial"/>
+          <w:bCs/>
+          <w:sz w:val="24"/>
+          <w:szCs w:val="24"/>
+        </w:rPr>
+        <w:t>Vasni</w:t>
+      </w:r>
+      <w:proofErr w:type="spellEnd"/>
+      <w:r>
+        <w:rPr>
+          <w:rFonts w:ascii="Arial Narrow" w:hAnsi="Arial Narrow" w:cs="Arial"/>
+          <w:bCs/>
           <w:sz w:val="24"/>
           <w:szCs w:val="24"/>
         </w:rPr>
         <w:t xml:space="preserve"> </w:t>
       </w:r>
-    </w:p>
-    <w:p>
-      <w:pPr>
-        <w:spacing w:after="0" w:line="360" w:lineRule="auto"/>
-        <w:ind w:firstLine="2552"/>
-        <w:jc w:val="both"/>
-        <w:rPr>
-          <w:rFonts w:ascii="Arial Narrow" w:hAnsi="Arial Narrow" w:cs="Arial"/>
-          <w:sz w:val="24"/>
-          <w:szCs w:val="24"/>
-        </w:rPr>
-      </w:pPr>
-    </w:p>
-    <w:p>
-      <w:pPr>
-        <w:spacing w:after="0" w:line="360" w:lineRule="auto"/>
-        <w:ind w:firstLine="2552"/>
-        <w:jc w:val="both"/>
-        <w:rPr>
-          <w:rFonts w:ascii="Arial Narrow" w:hAnsi="Arial Narrow" w:cs="Arial"/>
-          <w:sz w:val="24"/>
-          <w:szCs w:val="24"/>
-        </w:rPr>
-      </w:pPr>
-      <w:r>
-        <w:rPr>
-          <w:rFonts w:ascii="Arial Narrow" w:hAnsi="Arial Narrow" w:cs="Arial"/>
-          <w:sz w:val="24"/>
-          <w:szCs w:val="24"/>
-        </w:rPr>
-        <w:t xml:space="preserve">Nobre Magistrado Cláudio </w:t>
-      </w:r>
       <w:proofErr w:type="spellStart"/>
       <w:r>
         <w:rPr>
           <w:rFonts w:ascii="Arial Narrow" w:hAnsi="Arial Narrow" w:cs="Arial"/>
-          <w:sz w:val="24"/>
-          <w:szCs w:val="24"/>
-        </w:rPr>
-        <w:t>Ost</w:t>
+          <w:bCs/>
+          <w:sz w:val="24"/>
+          <w:szCs w:val="24"/>
+        </w:rPr>
+        <w:t>Paroski</w:t>
       </w:r>
       <w:proofErr w:type="spellEnd"/>
       <w:r>
         <w:rPr>
           <w:rFonts w:ascii="Arial Narrow" w:hAnsi="Arial Narrow" w:cs="Arial"/>
-          <w:sz w:val="24"/>
-          <w:szCs w:val="24"/>
-        </w:rPr>
-        <w:t xml:space="preserve"> definiu a situação, </w:t>
-      </w:r>
-      <w:r>
-        <w:rPr>
-          <w:rFonts w:ascii="Arial Narrow" w:hAnsi="Arial Narrow" w:cs="Arial"/>
-          <w:sz w:val="24"/>
-          <w:szCs w:val="24"/>
-        </w:rPr>
-        <w:t xml:space="preserve">como </w:t>
-      </w:r>
-      <w:r>
-        <w:rPr>
-          <w:rFonts w:ascii="Courier New" w:hAnsi="Courier New" w:cs="Arial"/>
-          <w:b/>
-          <w:i/>
-          <w:sz w:val="20"/>
-          <w:szCs w:val="20"/>
-        </w:rPr>
-        <w:t>“aquele que causa o dano moral deve sofrer no ´bolso´ dor igual a que fez sofrer moralmente a outra pessoa”.</w:t>
-      </w:r>
-      <w:r>
-        <w:rPr>
-          <w:rStyle w:val="Refdenotaderodap"/>
-          <w:rFonts w:ascii="Courier New" w:hAnsi="Courier New"/>
-          <w:b/>
-          <w:i/>
-          <w:sz w:val="20"/>
-          <w:szCs w:val="20"/>
-        </w:rPr>
-        <w:footnoteReference w:id="24"/>
-      </w:r>
-    </w:p>
-    <w:p>
-      <w:pPr>
-        <w:spacing w:after="0" w:line="360" w:lineRule="auto"/>
-        <w:ind w:firstLine="2552"/>
-        <w:jc w:val="both"/>
-        <w:rPr>
-          <w:rFonts w:ascii="Arial Narrow" w:hAnsi="Arial Narrow" w:cs="Arial"/>
-          <w:sz w:val="24"/>
-          <w:szCs w:val="24"/>
-        </w:rPr>
-      </w:pPr>
-    </w:p>
-    <w:p>
-      <w:pPr>
-        <w:spacing w:after="0" w:line="360" w:lineRule="auto"/>
-        <w:ind w:firstLine="2552"/>
-        <w:jc w:val="both"/>
-        <w:rPr>
-          <w:rFonts w:ascii="Arial Narrow" w:hAnsi="Arial Narrow" w:cs="Arial"/>
-          <w:sz w:val="24"/>
-          <w:szCs w:val="24"/>
-        </w:rPr>
-      </w:pPr>
-      <w:r>
-        <w:rPr>
-          <w:rFonts w:ascii="Arial Narrow" w:hAnsi="Arial Narrow" w:cs="Arial"/>
-          <w:sz w:val="24"/>
-          <w:szCs w:val="24"/>
-        </w:rPr>
-        <w:t xml:space="preserve">E para nortear-se no montante a ser fixado para a indenização, se deve levar em consideração as circunstâncias fáticas, condições das partes, inclusive econômicas; e por fim constituir-se em fator de desestímulo à pratica adotada pelos empregadores, em relação aos seus empregados. </w:t>
-      </w:r>
-    </w:p>
-    <w:p>
-      <w:pPr>
-        <w:spacing w:after="0" w:line="360" w:lineRule="auto"/>
-        <w:ind w:firstLine="2552"/>
-        <w:jc w:val="both"/>
-        <w:rPr>
-          <w:rFonts w:ascii="Arial Narrow" w:hAnsi="Arial Narrow" w:cs="Arial"/>
-          <w:sz w:val="24"/>
-          <w:szCs w:val="24"/>
-        </w:rPr>
-      </w:pPr>
-    </w:p>
-    <w:p>
-      <w:pPr>
-        <w:spacing w:after="0" w:line="360" w:lineRule="auto"/>
-        <w:ind w:firstLine="2552"/>
-        <w:jc w:val="both"/>
-        <w:rPr>
-          <w:rFonts w:ascii="Arial Narrow" w:hAnsi="Arial Narrow" w:cs="Arial"/>
-          <w:sz w:val="24"/>
-          <w:szCs w:val="24"/>
-        </w:rPr>
-      </w:pPr>
-      <w:r>
-        <w:rPr>
-          <w:rFonts w:ascii="Arial Narrow" w:hAnsi="Arial Narrow" w:cs="Arial"/>
-          <w:sz w:val="24"/>
-          <w:szCs w:val="24"/>
-        </w:rPr>
-        <w:t>Nesse passo, útil o evocar-se a advertência de Rui Manuel de Freitas Rangel, douto jurista português, o qual, com pena de mestre, afirmou que:</w:t>
-      </w:r>
-    </w:p>
-    <w:p>
-      <w:pPr>
-        <w:spacing w:after="0" w:line="360" w:lineRule="auto"/>
-        <w:ind w:firstLine="2552"/>
-        <w:jc w:val="both"/>
-        <w:rPr>
-          <w:rFonts w:ascii="Arial Narrow" w:hAnsi="Arial Narrow" w:cs="Arial"/>
-          <w:sz w:val="24"/>
-          <w:szCs w:val="24"/>
-        </w:rPr>
-      </w:pPr>
-    </w:p>
-    <w:p>
-      <w:pPr>
-        <w:spacing w:after="0" w:line="360" w:lineRule="auto"/>
-        <w:ind w:left="1134"/>
-        <w:jc w:val="both"/>
-        <w:rPr>
-          <w:rFonts w:ascii="Courier New" w:hAnsi="Courier New" w:cs="Arial"/>
-          <w:b/>
-          <w:i/>
-          <w:sz w:val="20"/>
-          <w:szCs w:val="20"/>
-        </w:rPr>
-      </w:pPr>
-      <w:r>
-        <w:rPr>
-          <w:rFonts w:ascii="Courier New" w:hAnsi="Courier New" w:cs="Arial"/>
-          <w:b/>
-          <w:i/>
-          <w:sz w:val="20"/>
-          <w:szCs w:val="20"/>
-        </w:rPr>
-        <w:t>“atualmente, a responsabilidade civil não cumpre verdadeiramente o seu desiderato principal que assenta na reparação justa e equitativa dos interesses jurídicos do lesado que foram violados através do comportamento culposo do lesante. É no domínio da profundidade ou densidade da reparação que este instituto tem falhado, quer quanto à indenização a fixar no âmbito dos danos morais ou não patrimoniais (onde se torna difícil, sobretudo fixar um valor, atenta a natureza de tais danos). O lesado é aqui confrontado, ao nível da indenização pelos danos não patrimoniais resultantes da violação, com um julgador que, a coberto de uma aparente equidade, se baseia em critérios miserabilistas e insensíveis, desajustados da prova integral dos fatos que lhe competia provar, para ter direito a uma indenização justa e adequada. Esta é, sem dúvida, a melhor forma de se ´matar´ o instituto da responsabilidade civil.”</w:t>
-      </w:r>
-      <w:r>
-        <w:rPr>
-          <w:rStyle w:val="Refdenotaderodap"/>
-          <w:rFonts w:ascii="Courier New" w:hAnsi="Courier New"/>
-          <w:b/>
-          <w:i/>
-          <w:sz w:val="20"/>
-          <w:szCs w:val="20"/>
-        </w:rPr>
-        <w:footnoteReference w:id="25"/>
-      </w:r>
-    </w:p>
-    <w:p>
-      <w:pPr>
-        <w:spacing w:after="0" w:line="360" w:lineRule="auto"/>
-        <w:ind w:firstLine="2552"/>
-        <w:jc w:val="both"/>
-        <w:rPr>
-          <w:rFonts w:ascii="Arial Narrow" w:hAnsi="Arial Narrow" w:cs="Arial"/>
-          <w:sz w:val="24"/>
-          <w:szCs w:val="24"/>
-        </w:rPr>
-      </w:pPr>
-    </w:p>
-    <w:p>
-      <w:pPr>
-        <w:spacing w:after="0" w:line="360" w:lineRule="auto"/>
-        <w:ind w:firstLine="2552"/>
-        <w:jc w:val="both"/>
-        <w:rPr>
-          <w:rFonts w:ascii="Arial Narrow" w:hAnsi="Arial Narrow" w:cs="Arial"/>
-          <w:sz w:val="24"/>
-          <w:szCs w:val="24"/>
-        </w:rPr>
-      </w:pPr>
-      <w:r>
-        <w:rPr>
-          <w:rFonts w:ascii="Arial Narrow" w:hAnsi="Arial Narrow" w:cs="Arial"/>
-          <w:sz w:val="24"/>
-          <w:szCs w:val="24"/>
-        </w:rPr>
-        <w:t xml:space="preserve">Em suma, vale ressaltar que a ofensa moral praticada pela exposição indevida da imagem em sede trabalhista, praticada ou permitida pelo empregador, é de ser considerada mais grave do que se cometida em outras situações, pois traduz abuso ou descaso reprovável, diante da inferioridade econômica do trabalhador e da pressão pela manutenção do emprego, podendo mesmo, em determinados casos, pendendo para ato de desumanidade, o que deve, também, ser considerado, na e para a fixação da indenização. </w:t>
-      </w:r>
-    </w:p>
-    <w:p>
-      <w:pPr>
-        <w:spacing w:after="0" w:line="360" w:lineRule="auto"/>
-        <w:ind w:firstLine="2552"/>
-        <w:jc w:val="both"/>
-        <w:rPr>
-          <w:rFonts w:ascii="Arial Narrow" w:hAnsi="Arial Narrow" w:cs="Arial"/>
-          <w:sz w:val="24"/>
-          <w:szCs w:val="24"/>
-        </w:rPr>
-      </w:pPr>
-    </w:p>
-    <w:p>
-      <w:pPr>
-        <w:spacing w:after="0" w:line="360" w:lineRule="auto"/>
-        <w:ind w:firstLine="2552"/>
-        <w:jc w:val="both"/>
-        <w:rPr>
-          <w:rFonts w:ascii="Arial Narrow" w:hAnsi="Arial Narrow" w:cs="Arial"/>
-          <w:sz w:val="24"/>
-          <w:szCs w:val="24"/>
-        </w:rPr>
-      </w:pPr>
-      <w:r>
-        <w:rPr>
-          <w:rFonts w:ascii="Arial Narrow" w:hAnsi="Arial Narrow" w:cs="Arial"/>
-          <w:sz w:val="24"/>
-          <w:szCs w:val="24"/>
-        </w:rPr>
-        <w:t>Assim, conclui-se que o uso da imagem do empregado pelo empregador sem a permissão daquele, é passível de indenização, conforme preceitua a Carta Magna, e a indenização deve ser fixada levando em consideração as circunstâncias fáticas, as condições das partes, inclusive econômicas e há de constituir-se em fator de desestímulo à pratica e postura adotada pela empresa, em relação aos seus empregados.</w:t>
-      </w:r>
-    </w:p>
-    <w:p>
-      <w:pPr>
-        <w:spacing w:after="0" w:line="360" w:lineRule="auto"/>
-        <w:ind w:firstLine="2552"/>
-        <w:jc w:val="both"/>
-        <w:rPr>
-          <w:rFonts w:ascii="Arial Narrow" w:hAnsi="Arial Narrow" w:cs="Arial"/>
-          <w:sz w:val="24"/>
-          <w:szCs w:val="24"/>
-        </w:rPr>
-      </w:pPr>
-    </w:p>
-    <w:p>
-      <w:pPr>
-        <w:spacing w:after="0" w:line="360" w:lineRule="auto"/>
-        <w:ind w:firstLine="2552"/>
-        <w:jc w:val="both"/>
-        <w:rPr>
-          <w:rFonts w:ascii="Arial Narrow" w:hAnsi="Arial Narrow" w:cs="Arial"/>
-          <w:sz w:val="24"/>
-          <w:szCs w:val="24"/>
-        </w:rPr>
-      </w:pPr>
-      <w:r>
-        <w:rPr>
-          <w:rFonts w:ascii="Arial Narrow" w:hAnsi="Arial Narrow" w:cs="Arial"/>
-          <w:sz w:val="24"/>
-          <w:szCs w:val="24"/>
-        </w:rPr>
-        <w:t xml:space="preserve">Destarte, tendo a </w:t>
-      </w:r>
-      <w:r>
-        <w:rPr>
-          <w:rFonts w:ascii="Arial Narrow" w:hAnsi="Arial Narrow" w:cs="Arial"/>
-          <w:sz w:val="24"/>
-          <w:szCs w:val="24"/>
-        </w:rPr>
-        <w:t>parte Ré se utilizado da imagem da parte</w:t>
-      </w:r>
-      <w:r>
-        <w:rPr>
-          <w:rFonts w:ascii="Arial Narrow" w:hAnsi="Arial Narrow" w:cs="Arial"/>
-          <w:sz w:val="24"/>
-          <w:szCs w:val="24"/>
-        </w:rPr>
-        <w:t xml:space="preserve"> Autor</w:t>
-      </w:r>
-      <w:r>
-        <w:rPr>
-          <w:rFonts w:ascii="Arial Narrow" w:hAnsi="Arial Narrow" w:cs="Arial"/>
-          <w:sz w:val="24"/>
-          <w:szCs w:val="24"/>
-        </w:rPr>
-        <w:t>a</w:t>
-      </w:r>
-      <w:r>
-        <w:rPr>
-          <w:rFonts w:ascii="Arial Narrow" w:hAnsi="Arial Narrow" w:cs="Arial"/>
-          <w:sz w:val="24"/>
-          <w:szCs w:val="24"/>
-        </w:rPr>
-        <w:t xml:space="preserve"> durante todo o pacto laboral, sem a devida contra-prestação, requer a sua condenação em danos morais decorr</w:t>
-      </w:r>
-      <w:r>
-        <w:rPr>
-          <w:rFonts w:ascii="Arial Narrow" w:hAnsi="Arial Narrow" w:cs="Arial"/>
-          <w:sz w:val="24"/>
-          <w:szCs w:val="24"/>
-        </w:rPr>
-        <w:t>entes da utilização da imagem da parte</w:t>
-      </w:r>
-      <w:r>
-        <w:rPr>
-          <w:rFonts w:ascii="Arial Narrow" w:hAnsi="Arial Narrow" w:cs="Arial"/>
-          <w:sz w:val="24"/>
-          <w:szCs w:val="24"/>
-        </w:rPr>
-        <w:t xml:space="preserve"> Autor</w:t>
-      </w:r>
-      <w:r>
-        <w:rPr>
-          <w:rFonts w:ascii="Arial Narrow" w:hAnsi="Arial Narrow" w:cs="Arial"/>
-          <w:sz w:val="24"/>
-          <w:szCs w:val="24"/>
-        </w:rPr>
-        <w:t>a.</w:t>
-      </w:r>
-    </w:p>
-    <w:p>
-      <w:pPr>
-        <w:spacing w:after="0" w:line="360" w:lineRule="auto"/>
-        <w:jc w:val="both"/>
-        <w:rPr>
-          <w:rFonts w:ascii="Arial Narrow" w:hAnsi="Arial Narrow" w:cs="Arial"/>
-          <w:sz w:val="24"/>
-          <w:szCs w:val="24"/>
-        </w:rPr>
-      </w:pPr>
-    </w:p>
-    <w:p>
-      <w:pPr>
-        <w:spacing w:after="0" w:line="360" w:lineRule="auto"/>
-        <w:ind w:firstLine="2552"/>
-        <w:jc w:val="both"/>
-        <w:rPr>
-          <w:rFonts w:ascii="Arial Narrow" w:hAnsi="Arial Narrow" w:cs="Arial"/>
-          <w:sz w:val="24"/>
-          <w:szCs w:val="24"/>
-        </w:rPr>
-      </w:pPr>
-    </w:p>
-    <w:p>
-      <w:pPr>
-        <w:spacing w:after="0" w:line="360" w:lineRule="auto"/>
-        <w:jc w:val="both"/>
-        <w:rPr>
-          <w:rFonts w:ascii="Arial Narrow" w:hAnsi="Arial Narrow" w:cs="Arial"/>
-          <w:b/>
-          <w:bCs/>
-          <w:i/>
-          <w:sz w:val="24"/>
-          <w:szCs w:val="24"/>
-        </w:rPr>
-      </w:pPr>
-      <w:r>
-        <w:rPr>
-          <w:rFonts w:ascii="Arial Narrow" w:hAnsi="Arial Narrow" w:cs="Arial"/>
-          <w:b/>
-          <w:bCs/>
-          <w:i/>
-          <w:sz w:val="24"/>
-          <w:szCs w:val="24"/>
-        </w:rPr>
-        <w:t>2</w:t>
-      </w:r>
-      <w:r>
-        <w:rPr>
-          <w:rFonts w:ascii="Arial Narrow" w:hAnsi="Arial Narrow" w:cs="Arial"/>
-          <w:b/>
-          <w:bCs/>
-          <w:i/>
-          <w:sz w:val="24"/>
-          <w:szCs w:val="24"/>
-        </w:rPr>
-        <w:t>4</w:t>
-      </w:r>
-      <w:r>
-        <w:rPr>
-          <w:rFonts w:ascii="Arial Narrow" w:hAnsi="Arial Narrow" w:cs="Arial"/>
-          <w:b/>
-          <w:bCs/>
-          <w:i/>
-          <w:sz w:val="24"/>
-          <w:szCs w:val="24"/>
-        </w:rPr>
-        <w:t>. – Assédio moral.</w:t>
-      </w:r>
-    </w:p>
-    <w:p>
-      <w:pPr>
-        <w:spacing w:after="0" w:line="360" w:lineRule="auto"/>
-        <w:jc w:val="both"/>
-        <w:rPr>
-          <w:rFonts w:ascii="Arial Narrow" w:hAnsi="Arial Narrow" w:cs="Arial"/>
-          <w:b/>
-          <w:bCs/>
-          <w:i/>
-          <w:sz w:val="24"/>
-          <w:szCs w:val="24"/>
-        </w:rPr>
-      </w:pPr>
-    </w:p>
-    <w:p>
-      <w:pPr>
-        <w:spacing w:after="0" w:line="360" w:lineRule="auto"/>
-        <w:ind w:firstLine="2552"/>
-        <w:jc w:val="both"/>
-        <w:rPr>
-          <w:rFonts w:ascii="Arial Narrow" w:hAnsi="Arial Narrow" w:cs="Arial"/>
-          <w:bCs/>
-          <w:sz w:val="24"/>
-          <w:szCs w:val="24"/>
-        </w:rPr>
-      </w:pPr>
-    </w:p>
-    <w:p>
-      <w:pPr>
-        <w:spacing w:after="0" w:line="360" w:lineRule="auto"/>
-        <w:ind w:firstLine="2552"/>
-        <w:jc w:val="both"/>
-        <w:rPr>
-          <w:rFonts w:ascii="Arial Narrow" w:hAnsi="Arial Narrow" w:cs="Arial"/>
-          <w:bCs/>
-          <w:sz w:val="24"/>
-          <w:szCs w:val="24"/>
-        </w:rPr>
-      </w:pPr>
-      <w:r>
-        <w:rPr>
-          <w:rFonts w:ascii="Arial Narrow" w:hAnsi="Arial Narrow" w:cs="Arial"/>
-          <w:bCs/>
-          <w:sz w:val="24"/>
-          <w:szCs w:val="24"/>
-        </w:rPr>
-        <w:t xml:space="preserve">A “coação moral” decorre, </w:t>
-      </w:r>
-      <w:r>
-        <w:rPr>
-          <w:rFonts w:ascii="Arial Narrow" w:hAnsi="Arial Narrow" w:cs="Arial"/>
-          <w:bCs/>
-          <w:i/>
-          <w:sz w:val="24"/>
-          <w:szCs w:val="24"/>
-        </w:rPr>
-        <w:t xml:space="preserve">in </w:t>
+          <w:bCs/>
+          <w:sz w:val="24"/>
+          <w:szCs w:val="24"/>
+        </w:rPr>
+        <w:t xml:space="preserve"> cita os seguintes exemplos caracterizadores do assédio moral: rigor excessivo, confiar tarefas inúteis ou degradantes, desqualificação, críticas em público, isolamento, inatividade forçada, ameaças, exploração de fragilidades psíquicas e físicas, limitação ou coibição de qualquer inovação ou iniciativa do trabalhador, obrigação de realizar </w:t>
       </w:r>
       <w:proofErr w:type="spellStart"/>
       <w:r>
         <w:rPr>
           <w:rFonts w:ascii="Arial Narrow" w:hAnsi="Arial Narrow" w:cs="Arial"/>
           <w:bCs/>
-          <w:i/>
-          <w:sz w:val="24"/>
-          <w:szCs w:val="24"/>
-        </w:rPr>
-        <w:t>casu</w:t>
+          <w:sz w:val="24"/>
+          <w:szCs w:val="24"/>
+        </w:rPr>
+        <w:t>auto-críticas</w:t>
       </w:r>
       <w:proofErr w:type="spellEnd"/>
       <w:r>
@@ -12829,121 +11455,7 @@
           <w:sz w:val="24"/>
           <w:szCs w:val="24"/>
         </w:rPr>
-        <w:t xml:space="preserve">, da imposição psicológica daquele que é mais forte na relação contratual para o aceite de condição desfavorável ao empregado. </w:t>
-      </w:r>
-    </w:p>
-    <w:p>
-      <w:pPr>
-        <w:spacing w:after="0" w:line="360" w:lineRule="auto"/>
-        <w:jc w:val="both"/>
-        <w:rPr>
-          <w:rFonts w:ascii="Arial Narrow" w:hAnsi="Arial Narrow" w:cs="Arial"/>
-          <w:b/>
-          <w:bCs/>
-          <w:i/>
-          <w:sz w:val="24"/>
-          <w:szCs w:val="24"/>
-        </w:rPr>
-      </w:pPr>
-    </w:p>
-    <w:p>
-      <w:pPr>
-        <w:pStyle w:val="Recuodecorpodetexto3"/>
-        <w:spacing w:line="360" w:lineRule="auto"/>
-        <w:ind w:firstLine="2552"/>
-        <w:rPr>
-          <w:rFonts w:ascii="Arial Narrow" w:hAnsi="Arial Narrow" w:cs="Arial"/>
-        </w:rPr>
-      </w:pPr>
-      <w:r>
-        <w:rPr>
-          <w:rFonts w:ascii="Arial Narrow" w:hAnsi="Arial Narrow" w:cs="Arial"/>
-          <w:i/>
-        </w:rPr>
-        <w:t xml:space="preserve">In </w:t>
-      </w:r>
-      <w:proofErr w:type="spellStart"/>
-      <w:r>
-        <w:rPr>
-          <w:rFonts w:ascii="Arial Narrow" w:hAnsi="Arial Narrow" w:cs="Arial"/>
-          <w:i/>
-        </w:rPr>
-        <w:t>casu</w:t>
-      </w:r>
-      <w:proofErr w:type="spellEnd"/>
-      <w:r>
-        <w:rPr>
-          <w:rFonts w:ascii="Arial Narrow" w:hAnsi="Arial Narrow" w:cs="Arial"/>
-        </w:rPr>
-        <w:t xml:space="preserve">, </w:t>
-      </w:r>
-      <w:r>
-        <w:rPr>
-          <w:rFonts w:ascii="Arial Narrow" w:hAnsi="Arial Narrow" w:cs="Arial"/>
-        </w:rPr>
-        <w:t>o</w:t>
-      </w:r>
-      <w:r>
-        <w:rPr>
-          <w:rFonts w:ascii="Arial Narrow" w:hAnsi="Arial Narrow" w:cs="Arial"/>
-        </w:rPr>
-        <w:t xml:space="preserve"> ambiente de trabalho </w:t>
-      </w:r>
-      <w:r>
-        <w:rPr>
-          <w:rFonts w:ascii="Arial Narrow" w:hAnsi="Arial Narrow" w:cs="Arial"/>
-        </w:rPr>
-        <w:t xml:space="preserve">tornou-se </w:t>
-      </w:r>
-      <w:r>
-        <w:rPr>
-          <w:rFonts w:ascii="Arial Narrow" w:hAnsi="Arial Narrow" w:cs="Arial"/>
-        </w:rPr>
-        <w:t>insuportável, causando</w:t>
-      </w:r>
-      <w:r>
-        <w:rPr>
-          <w:rFonts w:ascii="Arial Narrow" w:hAnsi="Arial Narrow" w:cs="Arial"/>
-        </w:rPr>
-        <w:t xml:space="preserve"> à parte Autora</w:t>
-      </w:r>
-      <w:r>
-        <w:rPr>
-          <w:rFonts w:ascii="Arial Narrow" w:hAnsi="Arial Narrow" w:cs="Arial"/>
-        </w:rPr>
-        <w:t>, inclusive, o adoecimento mental. O tratamento é degradante e afronta as mais comezinhas normas, não apenas ligadas a proteção do empregado, mas também aos direitos individuais constitucionalmente garantidos, albergados ao nosso plexo jurídico após anos infindáveis onde a discriminação reinava absoluta.</w:t>
-      </w:r>
-    </w:p>
-    <w:p>
-      <w:pPr>
-        <w:pStyle w:val="Recuodecorpodetexto3"/>
-        <w:spacing w:line="360" w:lineRule="auto"/>
-        <w:ind w:firstLine="2552"/>
-        <w:rPr>
-          <w:rFonts w:ascii="Arial Narrow" w:hAnsi="Arial Narrow" w:cs="Arial"/>
-        </w:rPr>
-      </w:pPr>
-    </w:p>
-    <w:p>
-      <w:pPr>
-        <w:spacing w:after="0" w:line="360" w:lineRule="auto"/>
-        <w:ind w:firstLine="2552"/>
-        <w:jc w:val="both"/>
-        <w:rPr>
-          <w:rFonts w:ascii="Arial Narrow" w:hAnsi="Arial Narrow" w:cs="Arial"/>
-          <w:bCs/>
-          <w:sz w:val="24"/>
-          <w:szCs w:val="24"/>
-        </w:rPr>
-      </w:pPr>
-      <w:r>
-        <w:rPr>
-          <w:rFonts w:ascii="Arial Narrow" w:hAnsi="Arial Narrow" w:cs="Arial"/>
-          <w:bCs/>
-          <w:sz w:val="24"/>
-          <w:szCs w:val="24"/>
-        </w:rPr>
-        <w:t>A psiquiatra francesa Marie-France Hirigoyen entende o assédio moral como sendo qualquer conduta abusiva, configurada através de gestos, palavras, comportamentos inadequados e atitudes que fogem do que é comumente aceito pela sociedade. Essa conduta abusiva, em razão de sua repetição ou sistematização, atenta contra a personalidade, dignidade ou integridade psíquica ou física de uma pessoa, ameaçando seu emprego ou degradando o ambiente de trabalho.</w:t>
+        <w:t xml:space="preserve"> em reuniões públicas, exposição a ridículo (impor a utilização de fantasia, sem que isso guarde qualquer relação com sua função e inclusão no rol de empregados com menor produtividade).</w:t>
       </w:r>
       <w:r>
         <w:rPr>
@@ -12953,42 +11465,42 @@
           <w:sz w:val="24"/>
           <w:szCs w:val="24"/>
         </w:rPr>
-        <w:footnoteReference w:id="26"/>
-      </w:r>
-    </w:p>
-    <w:p>
-      <w:pPr>
-        <w:spacing w:after="0" w:line="360" w:lineRule="auto"/>
-        <w:ind w:firstLine="2552"/>
-        <w:jc w:val="both"/>
-        <w:rPr>
-          <w:rFonts w:ascii="Arial Narrow" w:hAnsi="Arial Narrow" w:cs="Arial"/>
-          <w:bCs/>
-          <w:sz w:val="24"/>
-          <w:szCs w:val="24"/>
-        </w:rPr>
-      </w:pPr>
-    </w:p>
-    <w:p>
-      <w:pPr>
-        <w:spacing w:after="0" w:line="360" w:lineRule="auto"/>
-        <w:ind w:firstLine="2552"/>
-        <w:jc w:val="both"/>
-        <w:rPr>
-          <w:rFonts w:ascii="Arial Narrow" w:hAnsi="Arial Narrow" w:cs="Arial"/>
-          <w:bCs/>
-          <w:sz w:val="24"/>
-          <w:szCs w:val="24"/>
-        </w:rPr>
-      </w:pPr>
-      <w:r>
-        <w:rPr>
-          <w:rFonts w:ascii="Arial Narrow" w:hAnsi="Arial Narrow" w:cs="Arial"/>
-          <w:bCs/>
-          <w:sz w:val="24"/>
-          <w:szCs w:val="24"/>
-        </w:rPr>
-        <w:t xml:space="preserve">No mesmo sentido, Mauro </w:t>
+        <w:footnoteReference w:id="27"/>
+      </w:r>
+    </w:p>
+    <w:p>
+      <w:pPr>
+        <w:spacing w:after="0" w:line="360" w:lineRule="auto"/>
+        <w:ind w:firstLine="2552"/>
+        <w:jc w:val="both"/>
+        <w:rPr>
+          <w:rFonts w:ascii="Arial Narrow" w:hAnsi="Arial Narrow" w:cs="Arial"/>
+          <w:bCs/>
+          <w:sz w:val="24"/>
+          <w:szCs w:val="24"/>
+        </w:rPr>
+      </w:pPr>
+    </w:p>
+    <w:p>
+      <w:pPr>
+        <w:spacing w:after="0" w:line="360" w:lineRule="auto"/>
+        <w:ind w:firstLine="2552"/>
+        <w:jc w:val="both"/>
+        <w:rPr>
+          <w:rFonts w:ascii="Arial Narrow" w:hAnsi="Arial Narrow" w:cs="Arial"/>
+          <w:bCs/>
+          <w:sz w:val="24"/>
+          <w:szCs w:val="24"/>
+        </w:rPr>
+      </w:pPr>
+      <w:r>
+        <w:rPr>
+          <w:rFonts w:ascii="Arial Narrow" w:hAnsi="Arial Narrow" w:cs="Arial"/>
+          <w:bCs/>
+          <w:sz w:val="24"/>
+          <w:szCs w:val="24"/>
+        </w:rPr>
+        <w:t xml:space="preserve">Teófilo Furtado, citado por Irany Ferrari e Melchíades Rodrigues Martins, assevera que o assédio moral provoca danos os mais variados à saúde da vítima, a qual passa a ter pesadelos e sonhar com o agressor, inicia severo processo de insônia, baixa a sua </w:t>
       </w:r>
       <w:proofErr w:type="spellStart"/>
       <w:r>
@@ -12998,7 +11510,7 @@
           <w:sz w:val="24"/>
           <w:szCs w:val="24"/>
         </w:rPr>
-        <w:t>Vasni</w:t>
+        <w:t>auto-estima</w:t>
       </w:r>
       <w:proofErr w:type="spellEnd"/>
       <w:r>
@@ -13008,47 +11520,7 @@
           <w:sz w:val="24"/>
           <w:szCs w:val="24"/>
         </w:rPr>
-        <w:t xml:space="preserve"> </w:t>
-      </w:r>
-      <w:proofErr w:type="spellStart"/>
-      <w:r>
-        <w:rPr>
-          <w:rFonts w:ascii="Arial Narrow" w:hAnsi="Arial Narrow" w:cs="Arial"/>
-          <w:bCs/>
-          <w:sz w:val="24"/>
-          <w:szCs w:val="24"/>
-        </w:rPr>
-        <w:t>Paroski</w:t>
-      </w:r>
-      <w:proofErr w:type="spellEnd"/>
-      <w:r>
-        <w:rPr>
-          <w:rFonts w:ascii="Arial Narrow" w:hAnsi="Arial Narrow" w:cs="Arial"/>
-          <w:bCs/>
-          <w:sz w:val="24"/>
-          <w:szCs w:val="24"/>
-        </w:rPr>
-        <w:t xml:space="preserve"> cita os seguintes exemplos caracterizadores do assédio moral: rigor excessivo, confiar tarefas inúteis ou degradantes, desqualificação, críticas em público, isolamento, inatividade forçada, ameaças, exploração de fragilidades psíquicas e físicas, limitação ou coibição de qualquer inovação ou iniciativa do trabalhador, obrigação de realizar </w:t>
-      </w:r>
-      <w:proofErr w:type="spellStart"/>
-      <w:r>
-        <w:rPr>
-          <w:rFonts w:ascii="Arial Narrow" w:hAnsi="Arial Narrow" w:cs="Arial"/>
-          <w:bCs/>
-          <w:sz w:val="24"/>
-          <w:szCs w:val="24"/>
-        </w:rPr>
-        <w:t>auto-críticas</w:t>
-      </w:r>
-      <w:proofErr w:type="spellEnd"/>
-      <w:r>
-        <w:rPr>
-          <w:rFonts w:ascii="Arial Narrow" w:hAnsi="Arial Narrow" w:cs="Arial"/>
-          <w:bCs/>
-          <w:sz w:val="24"/>
-          <w:szCs w:val="24"/>
-        </w:rPr>
-        <w:t xml:space="preserve"> em reuniões públicas, exposição a ridículo (impor a utilização de fantasia, sem que isso guarde qualquer relação com sua função e inclusão no rol de empregados com menor produtividade).</w:t>
+        <w:t>; passa a ter pensamentos repetitivos e confusos, ao mesmo tempo que começa a ter dificuldade de memorização e concentração, num verdadeiro bloqueio mental; desenvolve um medo em relação ao futuro, quando não inicia um consumo exagerado de álcool ou mesmo de outras drogas; tem pensamentos suicidas ou mesmo chega a atentar contra a própria vida; desenvolve dores generalizadas, passa a ter distúrbios digestivos, hipertensão arterial, dores de cabeça, depressão, angústia, ansiedade, falta de ar, diminuição do apetite, emagrecimento ou aumento, sentimento de traição, raiva, mágoas e ressentimentos.</w:t>
       </w:r>
       <w:r>
         <w:rPr>
@@ -13058,107 +11530,490 @@
           <w:sz w:val="24"/>
           <w:szCs w:val="24"/>
         </w:rPr>
-        <w:footnoteReference w:id="27"/>
-      </w:r>
-    </w:p>
-    <w:p>
-      <w:pPr>
-        <w:spacing w:after="0" w:line="360" w:lineRule="auto"/>
-        <w:ind w:firstLine="2552"/>
-        <w:jc w:val="both"/>
-        <w:rPr>
-          <w:rFonts w:ascii="Arial Narrow" w:hAnsi="Arial Narrow" w:cs="Arial"/>
-          <w:bCs/>
-          <w:sz w:val="24"/>
-          <w:szCs w:val="24"/>
-        </w:rPr>
-      </w:pPr>
-    </w:p>
-    <w:p>
-      <w:pPr>
-        <w:spacing w:after="0" w:line="360" w:lineRule="auto"/>
-        <w:ind w:firstLine="2552"/>
-        <w:jc w:val="both"/>
-        <w:rPr>
-          <w:rFonts w:ascii="Arial Narrow" w:hAnsi="Arial Narrow" w:cs="Arial"/>
-          <w:bCs/>
-          <w:sz w:val="24"/>
-          <w:szCs w:val="24"/>
-        </w:rPr>
-      </w:pPr>
-      <w:r>
-        <w:rPr>
-          <w:rFonts w:ascii="Arial Narrow" w:hAnsi="Arial Narrow" w:cs="Arial"/>
-          <w:bCs/>
-          <w:sz w:val="24"/>
-          <w:szCs w:val="24"/>
-        </w:rPr>
-        <w:t xml:space="preserve">Teófilo Furtado, citado por Irany Ferrari e Melchíades Rodrigues Martins, assevera que o assédio moral provoca danos os mais variados à saúde da vítima, a qual passa a ter pesadelos e sonhar com o agressor, inicia severo processo de insônia, baixa a sua </w:t>
-      </w:r>
-      <w:proofErr w:type="spellStart"/>
-      <w:r>
-        <w:rPr>
-          <w:rFonts w:ascii="Arial Narrow" w:hAnsi="Arial Narrow" w:cs="Arial"/>
-          <w:bCs/>
-          <w:sz w:val="24"/>
-          <w:szCs w:val="24"/>
-        </w:rPr>
-        <w:t>auto-estima</w:t>
-      </w:r>
-      <w:proofErr w:type="spellEnd"/>
-      <w:r>
-        <w:rPr>
-          <w:rFonts w:ascii="Arial Narrow" w:hAnsi="Arial Narrow" w:cs="Arial"/>
-          <w:bCs/>
-          <w:sz w:val="24"/>
-          <w:szCs w:val="24"/>
-        </w:rPr>
-        <w:t>; passa a ter pensamentos repetitivos e confusos, ao mesmo tempo que começa a ter dificuldade de memorização e concentração, num verdadeiro bloqueio mental; desenvolve um medo em relação ao futuro, quando não inicia um consumo exagerado de álcool ou mesmo de outras drogas; tem pensamentos suicidas ou mesmo chega a atentar contra a própria vida; desenvolve dores generalizadas, passa a ter distúrbios digestivos, hipertensão arterial, dores de cabeça, depressão, angústia, ansiedade, falta de ar, diminuição do apetite, emagrecimento ou aumento, sentimento de traição, raiva, mágoas e ressentimentos.</w:t>
+        <w:footnoteReference w:id="28"/>
+      </w:r>
+    </w:p>
+    <w:p>
+      <w:pPr>
+        <w:spacing w:after="0" w:line="360" w:lineRule="auto"/>
+        <w:ind w:firstLine="2552"/>
+        <w:jc w:val="both"/>
+        <w:rPr>
+          <w:rFonts w:ascii="Arial Narrow" w:hAnsi="Arial Narrow" w:cs="Arial"/>
+          <w:bCs/>
+          <w:sz w:val="24"/>
+          <w:szCs w:val="24"/>
+        </w:rPr>
+      </w:pPr>
+    </w:p>
+    <w:p>
+      <w:pPr>
+        <w:spacing w:after="0" w:line="360" w:lineRule="auto"/>
+        <w:ind w:firstLine="2552"/>
+        <w:jc w:val="both"/>
+        <w:rPr>
+          <w:rFonts w:ascii="Arial Narrow" w:hAnsi="Arial Narrow" w:cs="Times New Roman"/>
+          <w:sz w:val="24"/>
+          <w:szCs w:val="24"/>
+          <w:lang w:eastAsia="pt-BR"/>
+        </w:rPr>
+      </w:pPr>
+      <w:r>
+        <w:rPr>
+          <w:rFonts w:ascii="Arial Narrow" w:hAnsi="Arial Narrow" w:cs="Arial"/>
+          <w:bCs/>
+          <w:sz w:val="24"/>
+          <w:szCs w:val="24"/>
+        </w:rPr>
+        <w:t xml:space="preserve">De fato, a </w:t>
+      </w:r>
+      <w:r>
+        <w:rPr>
+          <w:rFonts w:ascii="Arial Narrow" w:hAnsi="Arial Narrow" w:cs="Arial"/>
+          <w:bCs/>
+          <w:sz w:val="24"/>
+          <w:szCs w:val="24"/>
+        </w:rPr>
+        <w:t xml:space="preserve">parte </w:t>
+      </w:r>
+      <w:r>
+        <w:rPr>
+          <w:rFonts w:ascii="Arial Narrow" w:hAnsi="Arial Narrow" w:cs="Arial"/>
+          <w:bCs/>
+          <w:sz w:val="24"/>
+          <w:szCs w:val="24"/>
+        </w:rPr>
+        <w:t xml:space="preserve">Autora Adoeceu, física e mentalmente, inclusive </w:t>
+      </w:r>
+      <w:r>
+        <w:rPr>
+          <w:rFonts w:ascii="Arial Narrow" w:hAnsi="Arial Narrow" w:cs="Arial"/>
+          <w:b/>
+          <w:bCs/>
+          <w:sz w:val="24"/>
+          <w:szCs w:val="24"/>
+          <w:u w:val="single"/>
+        </w:rPr>
+        <w:t>somatizando fisicamente suas angústias psíquicas</w:t>
+      </w:r>
+      <w:r>
+        <w:rPr>
+          <w:rFonts w:ascii="Arial Narrow" w:hAnsi="Arial Narrow" w:cs="Arial"/>
+          <w:bCs/>
+          <w:sz w:val="24"/>
+          <w:szCs w:val="24"/>
+        </w:rPr>
+        <w:t xml:space="preserve">. </w:t>
+      </w:r>
+    </w:p>
+    <w:p>
+      <w:pPr>
+        <w:spacing w:after="0" w:line="360" w:lineRule="auto"/>
+        <w:ind w:firstLine="2552"/>
+        <w:jc w:val="both"/>
+        <w:rPr>
+          <w:rFonts w:ascii="Arial Narrow" w:hAnsi="Arial Narrow" w:cs="Arial"/>
+          <w:bCs/>
+        </w:rPr>
+      </w:pPr>
+      <w:r>
+        <w:rPr>
+          <w:rFonts w:ascii="Arial Narrow" w:hAnsi="Arial Narrow" w:cs="Arial"/>
+          <w:bCs/>
+          <w:sz w:val="24"/>
+          <w:szCs w:val="24"/>
+        </w:rPr>
+        <w:t>Os fatos narrados repercutiram, sem qualquer dúvida, na esfera de direitos subjetivos d</w:t>
+      </w:r>
+      <w:r>
+        <w:rPr>
+          <w:rFonts w:ascii="Arial Narrow" w:hAnsi="Arial Narrow" w:cs="Arial"/>
+          <w:bCs/>
+          <w:sz w:val="24"/>
+          <w:szCs w:val="24"/>
+        </w:rPr>
+        <w:t>a</w:t>
+      </w:r>
+      <w:r>
+        <w:rPr>
+          <w:rFonts w:ascii="Arial Narrow" w:hAnsi="Arial Narrow" w:cs="Arial"/>
+          <w:bCs/>
+          <w:sz w:val="24"/>
+          <w:szCs w:val="24"/>
+        </w:rPr>
+        <w:t xml:space="preserve"> </w:t>
+      </w:r>
+      <w:r>
+        <w:rPr>
+          <w:rFonts w:ascii="Arial Narrow" w:hAnsi="Arial Narrow" w:cs="Arial"/>
+          <w:bCs/>
+          <w:sz w:val="24"/>
+          <w:szCs w:val="24"/>
+        </w:rPr>
+        <w:t xml:space="preserve">parte </w:t>
+      </w:r>
+      <w:r>
+        <w:rPr>
+          <w:rFonts w:ascii="Arial Narrow" w:hAnsi="Arial Narrow" w:cs="Arial"/>
+          <w:bCs/>
+          <w:sz w:val="24"/>
+          <w:szCs w:val="24"/>
+        </w:rPr>
+        <w:t>Autor</w:t>
+      </w:r>
+      <w:r>
+        <w:rPr>
+          <w:rFonts w:ascii="Arial Narrow" w:hAnsi="Arial Narrow" w:cs="Arial"/>
+          <w:bCs/>
+          <w:sz w:val="24"/>
+          <w:szCs w:val="24"/>
+        </w:rPr>
+        <w:t>a</w:t>
+      </w:r>
+      <w:r>
+        <w:rPr>
+          <w:rFonts w:ascii="Arial Narrow" w:hAnsi="Arial Narrow" w:cs="Arial"/>
+          <w:bCs/>
+          <w:sz w:val="24"/>
+          <w:szCs w:val="24"/>
+        </w:rPr>
+        <w:t xml:space="preserve">. No caso particular, deve-se considerar que dano é </w:t>
+      </w:r>
+      <w:r>
+        <w:rPr>
+          <w:rFonts w:ascii="Courier New" w:hAnsi="Courier New" w:cs="Courier New"/>
+          <w:b/>
+          <w:bCs/>
+          <w:i/>
+          <w:sz w:val="20"/>
+          <w:szCs w:val="20"/>
+        </w:rPr>
+        <w:t>"qualquer lesão injusta a componentes do complexo de valores protegidos pelo Direito, incluindo, pois, o de caráter moral”</w:t>
       </w:r>
       <w:r>
         <w:rPr>
           <w:rStyle w:val="Refdenotaderodap"/>
-          <w:rFonts w:ascii="Arial Narrow" w:hAnsi="Arial Narrow"/>
-          <w:bCs/>
-          <w:sz w:val="24"/>
-          <w:szCs w:val="24"/>
-        </w:rPr>
-        <w:footnoteReference w:id="28"/>
-      </w:r>
-    </w:p>
-    <w:p>
-      <w:pPr>
-        <w:spacing w:after="0" w:line="360" w:lineRule="auto"/>
-        <w:ind w:firstLine="2552"/>
-        <w:jc w:val="both"/>
-        <w:rPr>
-          <w:rFonts w:ascii="Arial Narrow" w:hAnsi="Arial Narrow" w:cs="Arial"/>
-          <w:bCs/>
-          <w:sz w:val="24"/>
-          <w:szCs w:val="24"/>
-        </w:rPr>
-      </w:pPr>
-    </w:p>
-    <w:p>
-      <w:pPr>
-        <w:spacing w:after="0" w:line="360" w:lineRule="auto"/>
-        <w:ind w:firstLine="2552"/>
-        <w:jc w:val="both"/>
-        <w:rPr>
-          <w:rFonts w:ascii="Arial Narrow" w:hAnsi="Arial Narrow" w:cs="Times New Roman"/>
-          <w:sz w:val="24"/>
-          <w:szCs w:val="24"/>
-          <w:lang w:eastAsia="pt-BR"/>
-        </w:rPr>
-      </w:pPr>
-      <w:r>
-        <w:rPr>
-          <w:rFonts w:ascii="Arial Narrow" w:hAnsi="Arial Narrow" w:cs="Arial"/>
-          <w:bCs/>
-          <w:sz w:val="24"/>
-          <w:szCs w:val="24"/>
-        </w:rPr>
-        <w:t xml:space="preserve">De fato, a </w:t>
+          <w:rFonts w:ascii="Arial Narrow" w:hAnsi="Arial Narrow" w:cs="Arial"/>
+          <w:bCs/>
+        </w:rPr>
+        <w:footnoteReference w:id="29"/>
+      </w:r>
+      <w:r>
+        <w:rPr>
+          <w:rFonts w:ascii="Arial Narrow" w:hAnsi="Arial Narrow" w:cs="Arial"/>
+          <w:bCs/>
+          <w:sz w:val="24"/>
+          <w:szCs w:val="24"/>
+        </w:rPr>
+        <w:t xml:space="preserve">. Nesse sentido, Maria Helena Diniz, afirma que, </w:t>
+      </w:r>
+      <w:r>
+        <w:rPr>
+          <w:rFonts w:ascii="Courier New" w:hAnsi="Courier New" w:cs="Courier New"/>
+          <w:b/>
+          <w:bCs/>
+          <w:i/>
+          <w:sz w:val="20"/>
+          <w:szCs w:val="20"/>
+        </w:rPr>
+        <w:t>"o dano moral vem a ser lesão de interesse não patrimonial de pessoa física ou jurídica"</w:t>
+      </w:r>
+      <w:r>
+        <w:rPr>
+          <w:rStyle w:val="Refdenotaderodap"/>
+          <w:rFonts w:ascii="Arial Narrow" w:hAnsi="Arial Narrow" w:cs="Arial"/>
+          <w:bCs/>
+        </w:rPr>
+        <w:footnoteReference w:id="30"/>
+      </w:r>
+      <w:r>
+        <w:rPr>
+          <w:rFonts w:ascii="Arial Narrow" w:hAnsi="Arial Narrow" w:cs="Arial"/>
+          <w:bCs/>
+        </w:rPr>
+        <w:t>.</w:t>
+      </w:r>
+    </w:p>
+    <w:p>
+      <w:pPr>
+        <w:spacing w:after="0" w:line="360" w:lineRule="auto"/>
+        <w:ind w:firstLine="2552"/>
+        <w:jc w:val="both"/>
+        <w:rPr>
+          <w:rFonts w:ascii="Arial Narrow" w:hAnsi="Arial Narrow" w:cs="Arial"/>
+          <w:bCs/>
+          <w:sz w:val="24"/>
+          <w:szCs w:val="24"/>
+        </w:rPr>
+      </w:pPr>
+    </w:p>
+    <w:p>
+      <w:pPr>
+        <w:spacing w:after="0" w:line="360" w:lineRule="auto"/>
+        <w:ind w:firstLine="2552"/>
+        <w:jc w:val="both"/>
+        <w:rPr>
+          <w:rFonts w:ascii="Arial Narrow" w:hAnsi="Arial Narrow" w:cs="Arial"/>
+          <w:bCs/>
+          <w:sz w:val="24"/>
+          <w:szCs w:val="24"/>
+        </w:rPr>
+      </w:pPr>
+      <w:r>
+        <w:rPr>
+          <w:rFonts w:ascii="Arial Narrow" w:hAnsi="Arial Narrow" w:cs="Arial"/>
+          <w:bCs/>
+          <w:sz w:val="24"/>
+          <w:szCs w:val="24"/>
+        </w:rPr>
+        <w:t>Pois bem, adentrando na análise legal do tema, inicialmente é oportuno fazer referência à Constituição Federal de 1988, que foi muito clara ao dispor, no seu art. 5º, inciso X:</w:t>
+      </w:r>
+    </w:p>
+    <w:p>
+      <w:pPr>
+        <w:spacing w:after="0" w:line="360" w:lineRule="auto"/>
+        <w:jc w:val="both"/>
+        <w:rPr>
+          <w:rFonts w:ascii="Arial Narrow" w:hAnsi="Arial Narrow" w:cs="Arial"/>
+          <w:bCs/>
+          <w:sz w:val="24"/>
+          <w:szCs w:val="24"/>
+        </w:rPr>
+      </w:pPr>
+    </w:p>
+    <w:p>
+      <w:pPr>
+        <w:spacing w:after="0" w:line="360" w:lineRule="auto"/>
+        <w:ind w:left="1134"/>
+        <w:jc w:val="both"/>
+        <w:rPr>
+          <w:rFonts w:ascii="Courier New" w:hAnsi="Courier New" w:cs="Arial"/>
+          <w:b/>
+          <w:bCs/>
+          <w:i/>
+          <w:sz w:val="20"/>
+          <w:szCs w:val="20"/>
+        </w:rPr>
+      </w:pPr>
+      <w:r>
+        <w:rPr>
+          <w:rFonts w:ascii="Courier New" w:hAnsi="Courier New" w:cs="Arial"/>
+          <w:b/>
+          <w:bCs/>
+          <w:i/>
+          <w:sz w:val="20"/>
+          <w:szCs w:val="20"/>
+        </w:rPr>
+        <w:t>Art. 5º Todos são iguais perante a lei, sem distinção de qualquer natureza, garantindo-se aos brasileiros e aos estrangeiros residentes no País a inviolabilidade do direito à vida, à liberdade, à igualdade, à segurança e à propriedade, nos termos seguintes:</w:t>
+      </w:r>
+    </w:p>
+    <w:p>
+      <w:pPr>
+        <w:spacing w:after="0" w:line="360" w:lineRule="auto"/>
+        <w:ind w:left="1134"/>
+        <w:jc w:val="both"/>
+        <w:rPr>
+          <w:rFonts w:ascii="Courier New" w:hAnsi="Courier New" w:cs="Arial"/>
+          <w:b/>
+          <w:bCs/>
+          <w:i/>
+          <w:sz w:val="20"/>
+          <w:szCs w:val="20"/>
+        </w:rPr>
+      </w:pPr>
+    </w:p>
+    <w:p>
+      <w:pPr>
+        <w:spacing w:after="0" w:line="360" w:lineRule="auto"/>
+        <w:ind w:left="1134"/>
+        <w:jc w:val="both"/>
+        <w:rPr>
+          <w:rFonts w:ascii="Courier New" w:hAnsi="Courier New" w:cs="Arial"/>
+          <w:b/>
+          <w:bCs/>
+          <w:i/>
+          <w:sz w:val="20"/>
+          <w:szCs w:val="20"/>
+        </w:rPr>
+      </w:pPr>
+      <w:r>
+        <w:rPr>
+          <w:rFonts w:ascii="Courier New" w:hAnsi="Courier New" w:cs="Arial"/>
+          <w:b/>
+          <w:bCs/>
+          <w:i/>
+          <w:sz w:val="20"/>
+          <w:szCs w:val="20"/>
+        </w:rPr>
+        <w:t>(...)</w:t>
+      </w:r>
+    </w:p>
+    <w:p>
+      <w:pPr>
+        <w:spacing w:after="0" w:line="360" w:lineRule="auto"/>
+        <w:ind w:left="1134"/>
+        <w:jc w:val="both"/>
+        <w:rPr>
+          <w:rFonts w:ascii="Courier New" w:hAnsi="Courier New" w:cs="Arial"/>
+          <w:b/>
+          <w:bCs/>
+          <w:i/>
+          <w:sz w:val="20"/>
+          <w:szCs w:val="20"/>
+        </w:rPr>
+      </w:pPr>
+    </w:p>
+    <w:p>
+      <w:pPr>
+        <w:spacing w:after="0" w:line="360" w:lineRule="auto"/>
+        <w:ind w:left="1134"/>
+        <w:jc w:val="both"/>
+        <w:rPr>
+          <w:rFonts w:ascii="Courier New" w:hAnsi="Courier New" w:cs="Arial"/>
+          <w:b/>
+          <w:bCs/>
+          <w:i/>
+          <w:sz w:val="20"/>
+          <w:szCs w:val="20"/>
+        </w:rPr>
+      </w:pPr>
+      <w:r>
+        <w:rPr>
+          <w:rFonts w:ascii="Courier New" w:hAnsi="Courier New" w:cs="Arial"/>
+          <w:b/>
+          <w:bCs/>
+          <w:i/>
+          <w:sz w:val="20"/>
+          <w:szCs w:val="20"/>
+        </w:rPr>
+        <w:t>X - são invioláveis a intimidade, a vida privada, a honra e a imagem das pessoas, assegurado o direito a indenização pelo dano material ou moral decorrente de sua violação.</w:t>
+      </w:r>
+    </w:p>
+    <w:p>
+      <w:pPr>
+        <w:spacing w:after="0" w:line="360" w:lineRule="auto"/>
+        <w:ind w:firstLine="2552"/>
+        <w:jc w:val="both"/>
+        <w:rPr>
+          <w:rFonts w:ascii="Arial Narrow" w:hAnsi="Arial Narrow" w:cs="Arial"/>
+          <w:bCs/>
+          <w:sz w:val="24"/>
+          <w:szCs w:val="24"/>
+        </w:rPr>
+      </w:pPr>
+    </w:p>
+    <w:p>
+      <w:pPr>
+        <w:spacing w:after="0" w:line="360" w:lineRule="auto"/>
+        <w:ind w:firstLine="2552"/>
+        <w:jc w:val="both"/>
+        <w:rPr>
+          <w:rFonts w:ascii="Arial Narrow" w:hAnsi="Arial Narrow" w:cs="Arial"/>
+          <w:bCs/>
+          <w:sz w:val="24"/>
+          <w:szCs w:val="24"/>
+        </w:rPr>
+      </w:pPr>
+      <w:r>
+        <w:rPr>
+          <w:rFonts w:ascii="Arial Narrow" w:hAnsi="Arial Narrow" w:cs="Arial"/>
+          <w:bCs/>
+          <w:sz w:val="24"/>
+          <w:szCs w:val="24"/>
+        </w:rPr>
+        <w:t>Não obstante, o Código Civil traz em seu texto, o princípio geral de direito, guardião da teoria da responsabilidade civil, no seu art. 186, que dispõe:</w:t>
+      </w:r>
+    </w:p>
+    <w:p>
+      <w:pPr>
+        <w:spacing w:after="0" w:line="360" w:lineRule="auto"/>
+        <w:ind w:firstLine="2552"/>
+        <w:jc w:val="both"/>
+        <w:rPr>
+          <w:rFonts w:ascii="Arial Narrow" w:hAnsi="Arial Narrow" w:cs="Arial"/>
+          <w:bCs/>
+          <w:sz w:val="24"/>
+          <w:szCs w:val="24"/>
+        </w:rPr>
+      </w:pPr>
+    </w:p>
+    <w:p>
+      <w:pPr>
+        <w:spacing w:after="0" w:line="360" w:lineRule="auto"/>
+        <w:ind w:left="1134"/>
+        <w:jc w:val="both"/>
+        <w:rPr>
+          <w:rFonts w:ascii="Courier New" w:hAnsi="Courier New" w:cs="Arial"/>
+          <w:b/>
+          <w:bCs/>
+          <w:i/>
+          <w:sz w:val="20"/>
+          <w:szCs w:val="20"/>
+        </w:rPr>
+      </w:pPr>
+      <w:r>
+        <w:rPr>
+          <w:rFonts w:ascii="Courier New" w:hAnsi="Courier New" w:cs="Arial"/>
+          <w:b/>
+          <w:bCs/>
+          <w:i/>
+          <w:sz w:val="20"/>
+          <w:szCs w:val="20"/>
+        </w:rPr>
+        <w:t xml:space="preserve">Art. 186. Aquele que, por ação ou omissão voluntária, negligência ou imprudência, violar direito e causar dano a outrem, ainda que exclusivamente moral, comete ilícito. </w:t>
+      </w:r>
+    </w:p>
+    <w:p>
+      <w:pPr>
+        <w:spacing w:after="0" w:line="360" w:lineRule="auto"/>
+        <w:ind w:firstLine="2552"/>
+        <w:jc w:val="both"/>
+        <w:rPr>
+          <w:rFonts w:ascii="Arial Narrow" w:hAnsi="Arial Narrow" w:cs="Arial"/>
+          <w:bCs/>
+          <w:sz w:val="24"/>
+          <w:szCs w:val="24"/>
+        </w:rPr>
+      </w:pPr>
+    </w:p>
+    <w:p>
+      <w:pPr>
+        <w:spacing w:after="0" w:line="360" w:lineRule="auto"/>
+        <w:ind w:firstLine="2552"/>
+        <w:jc w:val="both"/>
+        <w:rPr>
+          <w:rFonts w:ascii="Arial Narrow" w:hAnsi="Arial Narrow" w:cs="Arial"/>
+          <w:bCs/>
+          <w:sz w:val="24"/>
+          <w:szCs w:val="24"/>
+        </w:rPr>
+      </w:pPr>
+      <w:r>
+        <w:rPr>
+          <w:rFonts w:ascii="Arial Narrow" w:hAnsi="Arial Narrow" w:cs="Arial"/>
+          <w:bCs/>
+          <w:sz w:val="24"/>
+          <w:szCs w:val="24"/>
+        </w:rPr>
+        <w:t xml:space="preserve">No caso presente, </w:t>
+      </w:r>
+      <w:r>
+        <w:rPr>
+          <w:rFonts w:ascii="Arial Narrow" w:hAnsi="Arial Narrow" w:cs="Arial"/>
+          <w:bCs/>
+          <w:sz w:val="24"/>
+          <w:szCs w:val="24"/>
+        </w:rPr>
+        <w:t>a</w:t>
+      </w:r>
+      <w:r>
+        <w:rPr>
+          <w:rFonts w:ascii="Arial Narrow" w:hAnsi="Arial Narrow" w:cs="Arial"/>
+          <w:bCs/>
+          <w:sz w:val="24"/>
+          <w:szCs w:val="24"/>
+        </w:rPr>
+        <w:t xml:space="preserve"> </w:t>
       </w:r>
       <w:r>
         <w:rPr>
@@ -13176,47 +12031,7 @@
           <w:sz w:val="24"/>
           <w:szCs w:val="24"/>
         </w:rPr>
-        <w:t xml:space="preserve">Autora Adoeceu, física e mentalmente, inclusive </w:t>
-      </w:r>
-      <w:r>
-        <w:rPr>
-          <w:rFonts w:ascii="Arial Narrow" w:hAnsi="Arial Narrow" w:cs="Arial"/>
-          <w:b/>
-          <w:bCs/>
-          <w:sz w:val="24"/>
-          <w:szCs w:val="24"/>
-          <w:u w:val="single"/>
-        </w:rPr>
-        <w:t>somatizando fisicamente suas angústias psíquicas</w:t>
-      </w:r>
-      <w:r>
-        <w:rPr>
-          <w:rFonts w:ascii="Arial Narrow" w:hAnsi="Arial Narrow" w:cs="Arial"/>
-          <w:bCs/>
-          <w:sz w:val="24"/>
-          <w:szCs w:val="24"/>
-        </w:rPr>
-        <w:t xml:space="preserve">. </w:t>
-      </w:r>
-    </w:p>
-    <w:p>
-      <w:pPr>
-        <w:spacing w:after="0" w:line="360" w:lineRule="auto"/>
-        <w:ind w:firstLine="2552"/>
-        <w:jc w:val="both"/>
-        <w:rPr>
-          <w:rFonts w:ascii="Arial Narrow" w:hAnsi="Arial Narrow" w:cs="Arial"/>
-          <w:bCs/>
-        </w:rPr>
-      </w:pPr>
-      <w:r>
-        <w:rPr>
-          <w:rFonts w:ascii="Arial Narrow" w:hAnsi="Arial Narrow" w:cs="Arial"/>
-          <w:bCs/>
-          <w:sz w:val="24"/>
-          <w:szCs w:val="24"/>
-        </w:rPr>
-        <w:t>Os fatos narrados repercutiram, sem qualquer dúvida, na esfera de direitos subjetivos d</w:t>
+        <w:t>Autor</w:t>
       </w:r>
       <w:r>
         <w:rPr>
@@ -13243,24 +12058,6 @@
           <w:sz w:val="24"/>
           <w:szCs w:val="24"/>
         </w:rPr>
-        <w:t xml:space="preserve">parte </w:t>
-      </w:r>
-      <w:r>
-        <w:rPr>
-          <w:rFonts w:ascii="Arial Narrow" w:hAnsi="Arial Narrow" w:cs="Arial"/>
-          <w:bCs/>
-          <w:sz w:val="24"/>
-          <w:szCs w:val="24"/>
-        </w:rPr>
-        <w:t>Autor</w:t>
-      </w:r>
-      <w:r>
-        <w:rPr>
-          <w:rFonts w:ascii="Arial Narrow" w:hAnsi="Arial Narrow" w:cs="Arial"/>
-          <w:bCs/>
-          <w:sz w:val="24"/>
-          <w:szCs w:val="24"/>
-        </w:rPr>
         <w:t>a</w:t>
       </w:r>
       <w:r>
@@ -13270,59 +12067,32 @@
           <w:sz w:val="24"/>
           <w:szCs w:val="24"/>
         </w:rPr>
-        <w:t xml:space="preserve">. No caso particular, deve-se considerar que dano é </w:t>
-      </w:r>
-      <w:r>
-        <w:rPr>
-          <w:rFonts w:ascii="Courier New" w:hAnsi="Courier New" w:cs="Courier New"/>
-          <w:b/>
-          <w:bCs/>
-          <w:i/>
-          <w:sz w:val="20"/>
-          <w:szCs w:val="20"/>
-        </w:rPr>
-        <w:t>"qualquer lesão injusta a componentes do complexo de valores protegidos pelo Direito, incluindo, pois, o de caráter moral”</w:t>
-      </w:r>
-      <w:r>
-        <w:rPr>
-          <w:rStyle w:val="Refdenotaderodap"/>
-          <w:rFonts w:ascii="Arial Narrow" w:hAnsi="Arial Narrow" w:cs="Arial"/>
-          <w:bCs/>
-        </w:rPr>
-        <w:footnoteReference w:id="29"/>
-      </w:r>
-      <w:r>
-        <w:rPr>
-          <w:rFonts w:ascii="Arial Narrow" w:hAnsi="Arial Narrow" w:cs="Arial"/>
-          <w:bCs/>
-          <w:sz w:val="24"/>
-          <w:szCs w:val="24"/>
-        </w:rPr>
-        <w:t xml:space="preserve">. Nesse sentido, Maria Helena Diniz, afirma que, </w:t>
-      </w:r>
-      <w:r>
-        <w:rPr>
-          <w:rFonts w:ascii="Courier New" w:hAnsi="Courier New" w:cs="Courier New"/>
-          <w:b/>
-          <w:bCs/>
-          <w:i/>
-          <w:sz w:val="20"/>
-          <w:szCs w:val="20"/>
-        </w:rPr>
-        <w:t>"o dano moral vem a ser lesão de interesse não patrimonial de pessoa física ou jurídica"</w:t>
-      </w:r>
-      <w:r>
-        <w:rPr>
-          <w:rStyle w:val="Refdenotaderodap"/>
-          <w:rFonts w:ascii="Arial Narrow" w:hAnsi="Arial Narrow" w:cs="Arial"/>
-          <w:bCs/>
-        </w:rPr>
-        <w:footnoteReference w:id="30"/>
-      </w:r>
-      <w:r>
-        <w:rPr>
-          <w:rFonts w:ascii="Arial Narrow" w:hAnsi="Arial Narrow" w:cs="Arial"/>
-          <w:bCs/>
+        <w:t>teve um direito seu, considerado pela nossa Carta Magna como fundamental, além de estar protegido pelo Código Civil, frontalmente atingido, pelo que se impõe a devida reparação</w:t>
+      </w:r>
+      <w:r>
+        <w:rPr>
+          <w:rFonts w:ascii="Arial Narrow" w:hAnsi="Arial Narrow" w:cs="Arial"/>
+          <w:bCs/>
+          <w:sz w:val="24"/>
+          <w:szCs w:val="24"/>
+        </w:rPr>
+        <w:t xml:space="preserve"> em montante suficiente</w:t>
+      </w:r>
+      <w:r>
+        <w:rPr>
+          <w:rFonts w:ascii="Arial Narrow" w:hAnsi="Arial Narrow" w:cs="Arial"/>
+          <w:bCs/>
+          <w:sz w:val="24"/>
+          <w:szCs w:val="24"/>
+        </w:rPr>
+        <w:t xml:space="preserve"> para a reparação do dano</w:t>
+      </w:r>
+      <w:r>
+        <w:rPr>
+          <w:rFonts w:ascii="Arial Narrow" w:hAnsi="Arial Narrow" w:cs="Arial"/>
+          <w:bCs/>
+          <w:sz w:val="24"/>
+          <w:szCs w:val="24"/>
         </w:rPr>
         <w:t>.</w:t>
       </w:r>
@@ -13330,376 +12100,41 @@
     <w:p>
       <w:pPr>
         <w:spacing w:after="0" w:line="360" w:lineRule="auto"/>
-        <w:ind w:firstLine="2552"/>
-        <w:jc w:val="both"/>
-        <w:rPr>
-          <w:rFonts w:ascii="Arial Narrow" w:hAnsi="Arial Narrow" w:cs="Arial"/>
-          <w:bCs/>
-          <w:sz w:val="24"/>
-          <w:szCs w:val="24"/>
-        </w:rPr>
-      </w:pPr>
-    </w:p>
-    <w:p>
-      <w:pPr>
-        <w:spacing w:after="0" w:line="360" w:lineRule="auto"/>
-        <w:ind w:firstLine="2552"/>
-        <w:jc w:val="both"/>
-        <w:rPr>
-          <w:rFonts w:ascii="Arial Narrow" w:hAnsi="Arial Narrow" w:cs="Arial"/>
-          <w:bCs/>
-          <w:sz w:val="24"/>
-          <w:szCs w:val="24"/>
-        </w:rPr>
-      </w:pPr>
-      <w:r>
-        <w:rPr>
-          <w:rFonts w:ascii="Arial Narrow" w:hAnsi="Arial Narrow" w:cs="Arial"/>
-          <w:bCs/>
-          <w:sz w:val="24"/>
-          <w:szCs w:val="24"/>
-        </w:rPr>
-        <w:t>Pois bem, adentrando na análise legal do tema, inicialmente é oportuno fazer referência à Constituição Federal de 1988, que foi muito clara ao dispor, no seu art. 5º, inciso X:</w:t>
-      </w:r>
-    </w:p>
-    <w:p>
-      <w:pPr>
-        <w:spacing w:after="0" w:line="360" w:lineRule="auto"/>
-        <w:jc w:val="both"/>
-        <w:rPr>
-          <w:rFonts w:ascii="Arial Narrow" w:hAnsi="Arial Narrow" w:cs="Arial"/>
-          <w:bCs/>
-          <w:sz w:val="24"/>
-          <w:szCs w:val="24"/>
-        </w:rPr>
-      </w:pPr>
-    </w:p>
-    <w:p>
-      <w:pPr>
-        <w:spacing w:after="0" w:line="360" w:lineRule="auto"/>
-        <w:ind w:left="1134"/>
-        <w:jc w:val="both"/>
-        <w:rPr>
-          <w:rFonts w:ascii="Courier New" w:hAnsi="Courier New" w:cs="Arial"/>
-          <w:b/>
-          <w:bCs/>
-          <w:i/>
-          <w:sz w:val="20"/>
-          <w:szCs w:val="20"/>
-        </w:rPr>
-      </w:pPr>
-      <w:r>
-        <w:rPr>
-          <w:rFonts w:ascii="Courier New" w:hAnsi="Courier New" w:cs="Arial"/>
-          <w:b/>
-          <w:bCs/>
-          <w:i/>
-          <w:sz w:val="20"/>
-          <w:szCs w:val="20"/>
-        </w:rPr>
-        <w:t>Art. 5º Todos são iguais perante a lei, sem distinção de qualquer natureza, garantindo-se aos brasileiros e aos estrangeiros residentes no País a inviolabilidade do direito à vida, à liberdade, à igualdade, à segurança e à propriedade, nos termos seguintes:</w:t>
-      </w:r>
-    </w:p>
-    <w:p>
-      <w:pPr>
-        <w:spacing w:after="0" w:line="360" w:lineRule="auto"/>
-        <w:ind w:left="1134"/>
-        <w:jc w:val="both"/>
-        <w:rPr>
-          <w:rFonts w:ascii="Courier New" w:hAnsi="Courier New" w:cs="Arial"/>
-          <w:b/>
-          <w:bCs/>
-          <w:i/>
-          <w:sz w:val="20"/>
-          <w:szCs w:val="20"/>
-        </w:rPr>
-      </w:pPr>
-    </w:p>
-    <w:p>
-      <w:pPr>
-        <w:spacing w:after="0" w:line="360" w:lineRule="auto"/>
-        <w:ind w:left="1134"/>
-        <w:jc w:val="both"/>
-        <w:rPr>
-          <w:rFonts w:ascii="Courier New" w:hAnsi="Courier New" w:cs="Arial"/>
-          <w:b/>
-          <w:bCs/>
-          <w:i/>
-          <w:sz w:val="20"/>
-          <w:szCs w:val="20"/>
-        </w:rPr>
-      </w:pPr>
-      <w:r>
-        <w:rPr>
-          <w:rFonts w:ascii="Courier New" w:hAnsi="Courier New" w:cs="Arial"/>
-          <w:b/>
-          <w:bCs/>
-          <w:i/>
-          <w:sz w:val="20"/>
-          <w:szCs w:val="20"/>
-        </w:rPr>
-        <w:t>(...)</w:t>
-      </w:r>
-    </w:p>
-    <w:p>
-      <w:pPr>
-        <w:spacing w:after="0" w:line="360" w:lineRule="auto"/>
-        <w:ind w:left="1134"/>
-        <w:jc w:val="both"/>
-        <w:rPr>
-          <w:rFonts w:ascii="Courier New" w:hAnsi="Courier New" w:cs="Arial"/>
-          <w:b/>
-          <w:bCs/>
-          <w:i/>
-          <w:sz w:val="20"/>
-          <w:szCs w:val="20"/>
-        </w:rPr>
-      </w:pPr>
-    </w:p>
-    <w:p>
-      <w:pPr>
-        <w:spacing w:after="0" w:line="360" w:lineRule="auto"/>
-        <w:ind w:left="1134"/>
-        <w:jc w:val="both"/>
-        <w:rPr>
-          <w:rFonts w:ascii="Courier New" w:hAnsi="Courier New" w:cs="Arial"/>
-          <w:b/>
-          <w:bCs/>
-          <w:i/>
-          <w:sz w:val="20"/>
-          <w:szCs w:val="20"/>
-        </w:rPr>
-      </w:pPr>
-      <w:r>
-        <w:rPr>
-          <w:rFonts w:ascii="Courier New" w:hAnsi="Courier New" w:cs="Arial"/>
-          <w:b/>
-          <w:bCs/>
-          <w:i/>
-          <w:sz w:val="20"/>
-          <w:szCs w:val="20"/>
-        </w:rPr>
-        <w:t>X - são invioláveis a intimidade, a vida privada, a honra e a imagem das pessoas, assegurado o direito a indenização pelo dano material ou moral decorrente de sua violação.</w:t>
-      </w:r>
-    </w:p>
-    <w:p>
-      <w:pPr>
-        <w:spacing w:after="0" w:line="360" w:lineRule="auto"/>
-        <w:ind w:firstLine="2552"/>
-        <w:jc w:val="both"/>
-        <w:rPr>
-          <w:rFonts w:ascii="Arial Narrow" w:hAnsi="Arial Narrow" w:cs="Arial"/>
-          <w:bCs/>
-          <w:sz w:val="24"/>
-          <w:szCs w:val="24"/>
-        </w:rPr>
-      </w:pPr>
-    </w:p>
-    <w:p>
-      <w:pPr>
-        <w:spacing w:after="0" w:line="360" w:lineRule="auto"/>
-        <w:ind w:firstLine="2552"/>
-        <w:jc w:val="both"/>
-        <w:rPr>
-          <w:rFonts w:ascii="Arial Narrow" w:hAnsi="Arial Narrow" w:cs="Arial"/>
-          <w:bCs/>
-          <w:sz w:val="24"/>
-          <w:szCs w:val="24"/>
-        </w:rPr>
-      </w:pPr>
-      <w:r>
-        <w:rPr>
-          <w:rFonts w:ascii="Arial Narrow" w:hAnsi="Arial Narrow" w:cs="Arial"/>
-          <w:bCs/>
-          <w:sz w:val="24"/>
-          <w:szCs w:val="24"/>
-        </w:rPr>
-        <w:t>Não obstante, o Código Civil traz em seu texto, o princípio geral de direito, guardião da teoria da responsabilidade civil, no seu art. 186, que dispõe:</w:t>
-      </w:r>
-    </w:p>
-    <w:p>
-      <w:pPr>
-        <w:spacing w:after="0" w:line="360" w:lineRule="auto"/>
-        <w:ind w:firstLine="2552"/>
-        <w:jc w:val="both"/>
-        <w:rPr>
-          <w:rFonts w:ascii="Arial Narrow" w:hAnsi="Arial Narrow" w:cs="Arial"/>
-          <w:bCs/>
-          <w:sz w:val="24"/>
-          <w:szCs w:val="24"/>
-        </w:rPr>
-      </w:pPr>
-    </w:p>
-    <w:p>
-      <w:pPr>
-        <w:spacing w:after="0" w:line="360" w:lineRule="auto"/>
-        <w:ind w:left="1134"/>
-        <w:jc w:val="both"/>
-        <w:rPr>
-          <w:rFonts w:ascii="Courier New" w:hAnsi="Courier New" w:cs="Arial"/>
-          <w:b/>
-          <w:bCs/>
-          <w:i/>
-          <w:sz w:val="20"/>
-          <w:szCs w:val="20"/>
-        </w:rPr>
-      </w:pPr>
-      <w:r>
-        <w:rPr>
-          <w:rFonts w:ascii="Courier New" w:hAnsi="Courier New" w:cs="Arial"/>
-          <w:b/>
-          <w:bCs/>
-          <w:i/>
-          <w:sz w:val="20"/>
-          <w:szCs w:val="20"/>
-        </w:rPr>
-        <w:t xml:space="preserve">Art. 186. Aquele que, por ação ou omissão voluntária, negligência ou imprudência, violar direito e causar dano a outrem, ainda que exclusivamente moral, comete ilícito. </w:t>
-      </w:r>
-    </w:p>
-    <w:p>
-      <w:pPr>
-        <w:spacing w:after="0" w:line="360" w:lineRule="auto"/>
-        <w:ind w:firstLine="2552"/>
-        <w:jc w:val="both"/>
-        <w:rPr>
-          <w:rFonts w:ascii="Arial Narrow" w:hAnsi="Arial Narrow" w:cs="Arial"/>
-          <w:bCs/>
-          <w:sz w:val="24"/>
-          <w:szCs w:val="24"/>
-        </w:rPr>
-      </w:pPr>
-    </w:p>
-    <w:p>
-      <w:pPr>
-        <w:spacing w:after="0" w:line="360" w:lineRule="auto"/>
-        <w:ind w:firstLine="2552"/>
-        <w:jc w:val="both"/>
-        <w:rPr>
-          <w:rFonts w:ascii="Arial Narrow" w:hAnsi="Arial Narrow" w:cs="Arial"/>
-          <w:bCs/>
-          <w:sz w:val="24"/>
-          <w:szCs w:val="24"/>
-        </w:rPr>
-      </w:pPr>
-      <w:r>
-        <w:rPr>
-          <w:rFonts w:ascii="Arial Narrow" w:hAnsi="Arial Narrow" w:cs="Arial"/>
-          <w:bCs/>
-          <w:sz w:val="24"/>
-          <w:szCs w:val="24"/>
-        </w:rPr>
-        <w:t xml:space="preserve">No caso presente, </w:t>
-      </w:r>
-      <w:r>
-        <w:rPr>
-          <w:rFonts w:ascii="Arial Narrow" w:hAnsi="Arial Narrow" w:cs="Arial"/>
-          <w:bCs/>
-          <w:sz w:val="24"/>
-          <w:szCs w:val="24"/>
-        </w:rPr>
-        <w:t>a</w:t>
-      </w:r>
-      <w:r>
-        <w:rPr>
-          <w:rFonts w:ascii="Arial Narrow" w:hAnsi="Arial Narrow" w:cs="Arial"/>
-          <w:bCs/>
-          <w:sz w:val="24"/>
-          <w:szCs w:val="24"/>
-        </w:rPr>
-        <w:t xml:space="preserve"> </w:t>
-      </w:r>
-      <w:r>
-        <w:rPr>
-          <w:rFonts w:ascii="Arial Narrow" w:hAnsi="Arial Narrow" w:cs="Arial"/>
-          <w:bCs/>
-          <w:sz w:val="24"/>
-          <w:szCs w:val="24"/>
-        </w:rPr>
-        <w:t xml:space="preserve">parte </w:t>
-      </w:r>
-      <w:r>
-        <w:rPr>
-          <w:rFonts w:ascii="Arial Narrow" w:hAnsi="Arial Narrow" w:cs="Arial"/>
-          <w:bCs/>
-          <w:sz w:val="24"/>
-          <w:szCs w:val="24"/>
-        </w:rPr>
-        <w:t>Autor</w:t>
-      </w:r>
-      <w:r>
-        <w:rPr>
-          <w:rFonts w:ascii="Arial Narrow" w:hAnsi="Arial Narrow" w:cs="Arial"/>
-          <w:bCs/>
-          <w:sz w:val="24"/>
-          <w:szCs w:val="24"/>
-        </w:rPr>
-        <w:t>a</w:t>
-      </w:r>
-      <w:r>
-        <w:rPr>
-          <w:rFonts w:ascii="Arial Narrow" w:hAnsi="Arial Narrow" w:cs="Arial"/>
-          <w:bCs/>
-          <w:sz w:val="24"/>
-          <w:szCs w:val="24"/>
-        </w:rPr>
-        <w:t xml:space="preserve"> </w:t>
-      </w:r>
-      <w:r>
-        <w:rPr>
-          <w:rFonts w:ascii="Arial Narrow" w:hAnsi="Arial Narrow" w:cs="Arial"/>
-          <w:bCs/>
-          <w:sz w:val="24"/>
-          <w:szCs w:val="24"/>
-        </w:rPr>
-        <w:t>a</w:t>
-      </w:r>
-      <w:r>
-        <w:rPr>
-          <w:rFonts w:ascii="Arial Narrow" w:hAnsi="Arial Narrow" w:cs="Arial"/>
-          <w:bCs/>
-          <w:sz w:val="24"/>
-          <w:szCs w:val="24"/>
-        </w:rPr>
-        <w:t>teve um direito seu, considerado pela nossa Carta Magna como fundamental, além de estar protegido pelo Código Civil, frontalmente atingido, pelo que se impõe a devida reparação</w:t>
-      </w:r>
-      <w:r>
-        <w:rPr>
-          <w:rFonts w:ascii="Arial Narrow" w:hAnsi="Arial Narrow" w:cs="Arial"/>
-          <w:bCs/>
-          <w:sz w:val="24"/>
-          <w:szCs w:val="24"/>
-        </w:rPr>
-        <w:t xml:space="preserve"> em montante suficiente</w:t>
-      </w:r>
-      <w:r>
-        <w:rPr>
-          <w:rFonts w:ascii="Arial Narrow" w:hAnsi="Arial Narrow" w:cs="Arial"/>
-          <w:bCs/>
-          <w:sz w:val="24"/>
-          <w:szCs w:val="24"/>
-        </w:rPr>
-        <w:t xml:space="preserve"> para a reparação do dano</w:t>
-      </w:r>
-      <w:r>
-        <w:rPr>
-          <w:rFonts w:ascii="Arial Narrow" w:hAnsi="Arial Narrow" w:cs="Arial"/>
-          <w:bCs/>
-          <w:sz w:val="24"/>
-          <w:szCs w:val="24"/>
-        </w:rPr>
-        <w:t>.</w:t>
-      </w:r>
-    </w:p>
-    <w:p>
-      <w:pPr>
-        <w:spacing w:after="0" w:line="360" w:lineRule="auto"/>
-        <w:jc w:val="both"/>
-        <w:rPr>
-          <w:rFonts w:ascii="Arial Narrow" w:hAnsi="Arial Narrow" w:cs="Arial"/>
-          <w:sz w:val="24"/>
-          <w:szCs w:val="24"/>
-        </w:rPr>
-      </w:pPr>
+        <w:jc w:val="both"/>
+        <w:rPr>
+          <w:rFonts w:ascii="Arial Narrow" w:hAnsi="Arial Narrow" w:cs="Arial"/>
+          <w:sz w:val="24"/>
+          <w:szCs w:val="24"/>
+        </w:rPr>
+      </w:pPr>
+    </w:p>
+    <w:p>
+      <w:pPr>
+        <w:pStyle w:val="Normal"/>
+        <w:rPr>
+          <w:vanish/>
+        </w:rPr>
+      </w:pPr>
+      <w:r>
+        <w:rPr>
+          <w:vanish/>
+        </w:rPr>
+        <w:t>{/assedio_ativo}</w:t>
+      </w:r>
+    </w:p>
+    <w:p>
+      <w:pPr>
+        <w:pStyle w:val="Normal"/>
+        <w:rPr>
+          <w:vanish/>
+        </w:rPr>
+      </w:pPr>
+      <w:r>
+        <w:rPr>
+          <w:vanish/>
+        </w:rPr>
+        <w:t>{#assedio_sexual_ativo}</w:t>
+      </w:r>
     </w:p>
     <w:p>
       <w:pPr>
@@ -14777,6 +13212,33 @@
     </w:p>
     <w:p>
       <w:pPr>
+        <w:pStyle w:val="Normal"/>
+        <w:rPr>
+          <w:vanish/>
+        </w:rPr>
+      </w:pPr>
+      <w:r>
+        <w:rPr>
+          <w:vanish/>
+        </w:rPr>
+        <w:t>{/assedio_sexual_ativo}</w:t>
+      </w:r>
+    </w:p>
+    <w:p>
+      <w:pPr>
+        <w:rPr>
+          <w:vanish/>
+        </w:rPr>
+      </w:pPr>
+      <w:r>
+        <w:rPr>
+          <w:vanish/>
+        </w:rPr>
+        <w:t>{#vinculo_ativo}</w:t>
+      </w:r>
+    </w:p>
+    <w:p>
+      <w:pPr>
         <w:pStyle w:val="Recuodecorpodetexto2"/>
         <w:spacing w:after="0" w:line="360" w:lineRule="auto"/>
         <w:ind w:left="0"/>
@@ -17371,6 +15833,32 @@
     </w:p>
     <w:p>
       <w:pPr>
+        <w:rPr>
+          <w:vanish/>
+        </w:rPr>
+      </w:pPr>
+      <w:r>
+        <w:rPr>
+          <w:vanish/>
+        </w:rPr>
+        <w:t>{/vinculo_ativo}</w:t>
+      </w:r>
+    </w:p>
+    <w:p>
+      <w:pPr>
+        <w:rPr>
+          <w:vanish/>
+        </w:rPr>
+      </w:pPr>
+      <w:r>
+        <w:rPr>
+          <w:vanish/>
+        </w:rPr>
+        <w:t>{#insalubridade_ativa}</w:t>
+      </w:r>
+    </w:p>
+    <w:p>
+      <w:pPr>
         <w:spacing w:after="0" w:line="360" w:lineRule="auto"/>
         <w:jc w:val="both"/>
         <w:rPr>
@@ -18031,6 +16519,32 @@
     </w:p>
     <w:p>
       <w:pPr>
+        <w:rPr>
+          <w:vanish/>
+        </w:rPr>
+      </w:pPr>
+      <w:r>
+        <w:rPr>
+          <w:vanish/>
+        </w:rPr>
+        <w:t>{/insalubridade_ativa}</w:t>
+      </w:r>
+    </w:p>
+    <w:p>
+      <w:pPr>
+        <w:rPr>
+          <w:vanish/>
+        </w:rPr>
+      </w:pPr>
+      <w:r>
+        <w:rPr>
+          <w:vanish/>
+        </w:rPr>
+        <w:t>{#pausas_termicas_ativa}</w:t>
+      </w:r>
+    </w:p>
+    <w:p>
+      <w:pPr>
         <w:spacing w:after="0" w:line="360" w:lineRule="auto"/>
         <w:jc w:val="both"/>
         <w:rPr>
@@ -18702,6 +17216,32 @@
     </w:p>
     <w:p>
       <w:pPr>
+        <w:rPr>
+          <w:vanish/>
+        </w:rPr>
+      </w:pPr>
+      <w:r>
+        <w:rPr>
+          <w:vanish/>
+        </w:rPr>
+        <w:t>{/pausas_termicas_ativa}</w:t>
+      </w:r>
+    </w:p>
+    <w:p>
+      <w:pPr>
+        <w:rPr>
+          <w:vanish/>
+        </w:rPr>
+      </w:pPr>
+      <w:r>
+        <w:rPr>
+          <w:vanish/>
+        </w:rPr>
+        <w:t>{#reversao_justa_causa_ativa}</w:t>
+      </w:r>
+    </w:p>
+    <w:p>
+      <w:pPr>
         <w:spacing w:after="0" w:line="360" w:lineRule="auto"/>
         <w:jc w:val="both"/>
         <w:rPr>
@@ -19542,685 +18082,29 @@
     </w:p>
     <w:p>
       <w:pPr>
-        <w:spacing w:after="0" w:line="360" w:lineRule="auto"/>
-        <w:jc w:val="both"/>
-        <w:rPr>
-          <w:rFonts w:ascii="Arial Narrow" w:hAnsi="Arial Narrow" w:cs="Arial"/>
-          <w:b/>
-          <w:bCs/>
-          <w:i/>
-          <w:sz w:val="24"/>
-          <w:szCs w:val="24"/>
-        </w:rPr>
-      </w:pPr>
-      <w:r>
-        <w:rPr>
-          <w:rFonts w:ascii="Arial Narrow" w:hAnsi="Arial Narrow" w:cs="Arial"/>
-          <w:b/>
-          <w:bCs/>
-          <w:i/>
-          <w:sz w:val="24"/>
-          <w:szCs w:val="24"/>
-        </w:rPr>
-        <w:t>30</w:t>
-      </w:r>
-      <w:r>
-        <w:rPr>
-          <w:rFonts w:ascii="Arial Narrow" w:hAnsi="Arial Narrow" w:cs="Arial"/>
-          <w:b/>
-          <w:bCs/>
-          <w:i/>
-          <w:sz w:val="24"/>
-          <w:szCs w:val="24"/>
-        </w:rPr>
-        <w:t>. – Reversão da justa causa e verbas rescisórias</w:t>
-      </w:r>
-      <w:r>
-        <w:rPr>
-          <w:rFonts w:ascii="Arial Narrow" w:hAnsi="Arial Narrow" w:cs="Arial"/>
-          <w:b/>
-          <w:bCs/>
-          <w:i/>
-          <w:sz w:val="24"/>
-          <w:szCs w:val="24"/>
-        </w:rPr>
-        <w:t>: dependente químico.</w:t>
-      </w:r>
-    </w:p>
-    <w:p>
-      <w:pPr>
-        <w:spacing w:after="0" w:line="360" w:lineRule="auto"/>
-        <w:ind w:firstLine="2552"/>
-        <w:jc w:val="both"/>
-        <w:rPr>
-          <w:rFonts w:ascii="Arial Narrow" w:hAnsi="Arial Narrow" w:cs="Arial"/>
-          <w:bCs/>
-          <w:sz w:val="24"/>
-          <w:szCs w:val="24"/>
-        </w:rPr>
-      </w:pPr>
-    </w:p>
-    <w:p>
-      <w:pPr>
-        <w:spacing w:after="0" w:line="360" w:lineRule="auto"/>
-        <w:ind w:firstLine="2552"/>
-        <w:jc w:val="both"/>
-        <w:rPr>
-          <w:rFonts w:ascii="Arial Narrow" w:hAnsi="Arial Narrow" w:cs="Arial"/>
-          <w:bCs/>
-          <w:sz w:val="24"/>
-          <w:szCs w:val="24"/>
-        </w:rPr>
-      </w:pPr>
-    </w:p>
-    <w:p>
-      <w:pPr>
-        <w:spacing w:after="0" w:line="360" w:lineRule="auto"/>
-        <w:ind w:firstLine="2552"/>
-        <w:jc w:val="both"/>
-        <w:rPr>
-          <w:rFonts w:ascii="Arial Narrow" w:hAnsi="Arial Narrow" w:cs="Arial"/>
-          <w:sz w:val="24"/>
-          <w:szCs w:val="24"/>
-        </w:rPr>
-      </w:pPr>
-      <w:r>
-        <w:rPr>
-          <w:rFonts w:ascii="Arial Narrow" w:hAnsi="Arial Narrow" w:cs="Arial"/>
-          <w:sz w:val="24"/>
-          <w:szCs w:val="24"/>
-        </w:rPr>
-        <w:t xml:space="preserve">A justa causa como motivo para a rescisão do contrato de trabalho foi aplicada </w:t>
-      </w:r>
-      <w:r>
-        <w:rPr>
-          <w:rFonts w:ascii="Arial Narrow" w:hAnsi="Arial Narrow" w:cs="Arial"/>
-          <w:sz w:val="24"/>
-          <w:szCs w:val="24"/>
-        </w:rPr>
-        <w:t>de maneira distorcida e distanciada da verdade, sendo que não houve evento desidioso e, ainda que assim fosse considerado, dado o histórico profissional da Autora, não justificaria a rescisão do contrato por justa causa.</w:t>
-      </w:r>
-    </w:p>
-    <w:p>
-      <w:pPr>
-        <w:spacing w:after="0" w:line="360" w:lineRule="auto"/>
-        <w:ind w:firstLine="2552"/>
-        <w:jc w:val="both"/>
-        <w:rPr>
-          <w:rFonts w:ascii="Arial Narrow" w:hAnsi="Arial Narrow" w:cs="Arial"/>
-          <w:sz w:val="24"/>
-          <w:szCs w:val="24"/>
-        </w:rPr>
-      </w:pPr>
-    </w:p>
-    <w:p>
-      <w:pPr>
-        <w:spacing w:after="0" w:line="360" w:lineRule="auto"/>
-        <w:ind w:firstLine="2552"/>
-        <w:jc w:val="both"/>
-        <w:rPr>
-          <w:rFonts w:ascii="Arial Narrow" w:hAnsi="Arial Narrow" w:cs="Arial"/>
-          <w:sz w:val="24"/>
-          <w:szCs w:val="24"/>
-        </w:rPr>
-      </w:pPr>
-      <w:r>
-        <w:rPr>
-          <w:rFonts w:ascii="Arial Narrow" w:hAnsi="Arial Narrow" w:cs="Arial"/>
-          <w:sz w:val="24"/>
-          <w:szCs w:val="24"/>
-        </w:rPr>
-        <w:t xml:space="preserve">Não bastasse as fortes provas no sentido de inexistência do alegado motivo para rescisão do contrato de trabalho por justa causa, deve-se lembrar que </w:t>
-      </w:r>
-      <w:r>
-        <w:rPr>
-          <w:rFonts w:ascii="Arial Narrow" w:hAnsi="Arial Narrow" w:cs="Arial"/>
-          <w:sz w:val="24"/>
-          <w:szCs w:val="24"/>
-        </w:rPr>
-        <w:t>o Autor é dependente químico, condição considerada como doença pela Organização Mundial da Saúde, classificada como CID F19 (</w:t>
-      </w:r>
-      <w:r>
-        <w:rPr>
-          <w:rFonts w:ascii="Arial Narrow" w:hAnsi="Arial Narrow" w:cs="Arial"/>
-          <w:sz w:val="24"/>
-          <w:szCs w:val="24"/>
-        </w:rPr>
-        <w:t>Transtornos mentais e comportamentais devidos ao uso de múltiplas drogas e ao uso de outras substâncias psicoativas</w:t>
-      </w:r>
-      <w:r>
-        <w:rPr>
-          <w:rFonts w:ascii="Arial Narrow" w:hAnsi="Arial Narrow" w:cs="Arial"/>
-          <w:sz w:val="24"/>
-          <w:szCs w:val="24"/>
-        </w:rPr>
-        <w:t>). Assim, a Ré deveria ter encaminhado o Autor para que realizasse tratamento de saúde e, se necessário, afastamento previdenciário por incapacidade temporária. Inclusive, vale ressaltar que há muito tempo o INSS vem concedendo benefício de auxílio-doença para os dependentes químicos aos que cumprem os requisitos para recebimento do benefício.</w:t>
-      </w:r>
-    </w:p>
-    <w:p>
-      <w:pPr>
-        <w:spacing w:after="0" w:line="360" w:lineRule="auto"/>
-        <w:ind w:firstLine="2552"/>
-        <w:jc w:val="both"/>
-        <w:rPr>
-          <w:rFonts w:ascii="Arial Narrow" w:hAnsi="Arial Narrow" w:cs="Arial"/>
-          <w:sz w:val="24"/>
-          <w:szCs w:val="24"/>
-        </w:rPr>
-      </w:pPr>
-    </w:p>
-    <w:p>
-      <w:pPr>
-        <w:spacing w:after="0" w:line="360" w:lineRule="auto"/>
-        <w:ind w:firstLine="2552"/>
-        <w:jc w:val="both"/>
-        <w:rPr>
-          <w:rFonts w:ascii="Arial Narrow" w:hAnsi="Arial Narrow" w:cs="Arial"/>
-          <w:sz w:val="24"/>
-          <w:szCs w:val="24"/>
-        </w:rPr>
-      </w:pPr>
-      <w:r>
-        <w:rPr>
-          <w:rFonts w:ascii="Arial Narrow" w:hAnsi="Arial Narrow" w:cs="Arial"/>
-          <w:sz w:val="24"/>
-          <w:szCs w:val="24"/>
-        </w:rPr>
-        <w:t xml:space="preserve">Ao invés de contribuir para que </w:t>
-      </w:r>
-      <w:r>
-        <w:rPr>
-          <w:rFonts w:ascii="Arial Narrow" w:hAnsi="Arial Narrow" w:cs="Arial"/>
-          <w:sz w:val="24"/>
-          <w:szCs w:val="24"/>
-        </w:rPr>
-        <w:t>a</w:t>
-      </w:r>
-      <w:r>
-        <w:rPr>
-          <w:rFonts w:ascii="Arial Narrow" w:hAnsi="Arial Narrow" w:cs="Arial"/>
-          <w:sz w:val="24"/>
-          <w:szCs w:val="24"/>
-        </w:rPr>
-        <w:t xml:space="preserve"> </w:t>
-      </w:r>
-      <w:r>
-        <w:rPr>
-          <w:rFonts w:ascii="Arial Narrow" w:hAnsi="Arial Narrow" w:cs="Arial"/>
-          <w:sz w:val="24"/>
-          <w:szCs w:val="24"/>
-        </w:rPr>
-        <w:t xml:space="preserve">parte </w:t>
-      </w:r>
-      <w:r>
-        <w:rPr>
-          <w:rFonts w:ascii="Arial Narrow" w:hAnsi="Arial Narrow" w:cs="Arial"/>
-          <w:sz w:val="24"/>
-          <w:szCs w:val="24"/>
-        </w:rPr>
-        <w:t>Autor</w:t>
-      </w:r>
-      <w:r>
-        <w:rPr>
-          <w:rFonts w:ascii="Arial Narrow" w:hAnsi="Arial Narrow" w:cs="Arial"/>
-          <w:sz w:val="24"/>
-          <w:szCs w:val="24"/>
-        </w:rPr>
-        <w:t>a</w:t>
-      </w:r>
-      <w:r>
-        <w:rPr>
-          <w:rFonts w:ascii="Arial Narrow" w:hAnsi="Arial Narrow" w:cs="Arial"/>
-          <w:sz w:val="24"/>
-          <w:szCs w:val="24"/>
-        </w:rPr>
-        <w:t xml:space="preserve"> se recuperasse, promoveu a demissão por suposta justa causa, o que, dependendo do indivíduo, pode encaminhá-lo para o “fim do túnel”, ao lidar com a infeliz notícia da demissão e incerteza do futuro.</w:t>
-      </w:r>
-    </w:p>
-    <w:p>
-      <w:pPr>
-        <w:spacing w:after="0" w:line="360" w:lineRule="auto"/>
-        <w:ind w:firstLine="2552"/>
-        <w:jc w:val="both"/>
-        <w:rPr>
-          <w:rFonts w:ascii="Arial Narrow" w:hAnsi="Arial Narrow" w:cs="Arial"/>
-          <w:sz w:val="24"/>
-          <w:szCs w:val="24"/>
-        </w:rPr>
-      </w:pPr>
-    </w:p>
-    <w:p>
-      <w:pPr>
-        <w:spacing w:after="0" w:line="360" w:lineRule="auto"/>
-        <w:ind w:firstLine="2552"/>
-        <w:jc w:val="both"/>
-        <w:rPr>
-          <w:rFonts w:ascii="Arial Narrow" w:hAnsi="Arial Narrow" w:cs="Arial"/>
-          <w:sz w:val="24"/>
-          <w:szCs w:val="24"/>
-        </w:rPr>
-      </w:pPr>
-      <w:r>
-        <w:rPr>
-          <w:rFonts w:ascii="Arial Narrow" w:hAnsi="Arial Narrow" w:cs="Arial"/>
-          <w:sz w:val="24"/>
-          <w:szCs w:val="24"/>
-        </w:rPr>
-        <w:t xml:space="preserve">A jurisprudência pátria, aliás, </w:t>
-      </w:r>
-      <w:r>
-        <w:rPr>
-          <w:rFonts w:ascii="Arial Narrow" w:hAnsi="Arial Narrow" w:cs="Arial"/>
-          <w:sz w:val="24"/>
-          <w:szCs w:val="24"/>
-        </w:rPr>
-        <w:t>vem pacificando o entendimento de que a demissão de dependente químico, causada por “desídia”, é ilegal, pois o empregado está doente, sem capacidade de discernimento daquilo que lhe é prejudicial ou benéfico, ou seja, sem capacidade das próprias faculdades.</w:t>
-      </w:r>
-      <w:r>
-        <w:rPr>
-          <w:rFonts w:ascii="Arial Narrow" w:hAnsi="Arial Narrow" w:cs="Arial"/>
-          <w:sz w:val="24"/>
-          <w:szCs w:val="24"/>
-        </w:rPr>
-        <w:t xml:space="preserve"> </w:t>
-      </w:r>
-      <w:r>
-        <w:rPr>
-          <w:rFonts w:ascii="Arial Narrow" w:hAnsi="Arial Narrow" w:cs="Arial"/>
-          <w:sz w:val="24"/>
-          <w:szCs w:val="24"/>
-        </w:rPr>
-        <w:t>Nesse sentido, vale citar o entendimento do Tribunal Regional do Trabalho da 24ª Região sobre o tema:</w:t>
-      </w:r>
-    </w:p>
-    <w:p>
-      <w:pPr>
-        <w:spacing w:after="0" w:line="360" w:lineRule="auto"/>
-        <w:ind w:firstLine="2552"/>
-        <w:jc w:val="both"/>
-        <w:rPr>
-          <w:rFonts w:ascii="Arial Narrow" w:hAnsi="Arial Narrow" w:cs="Arial"/>
-          <w:sz w:val="24"/>
-          <w:szCs w:val="24"/>
-        </w:rPr>
-      </w:pPr>
-    </w:p>
-    <w:p>
-      <w:pPr>
-        <w:pStyle w:val="Citao"/>
-      </w:pPr>
-      <w:r>
-        <w:t>DISPENSA POR JUSTA CAUSA. DEPENDÊNCIA QUÍMICA. REVERSÃO. 1. Em reverência ao princípio da continuidade da relação de emprego, e por configurar situação extraordinária, para o término da relação empregatícia por justa causa, a reclamada deve comprovar a existência de conduta tipificada em lei, imediatidade da punição, proporcionalidade entre a falta e a pena e ausência de punição para a mesma falta. 2. No caso, não restou caracterizado abandono de emprego, apesar das diversas faltas injustificadas ao trabalho, não houve gradação de penalidades e o comportamento do empregador caracterizou perdão tácito. 3. Ademais, o autor é dependente químico, que se constitui em doença grave e estigmatizante, e impede a rescisão contratual por justa causa. Inteligência da Súmula 443 do TST. 4. A hipótese é de reversão da dispensa por justa causa em dispensa sem justa causa por iniciativa do empregador. 5. Recurso provido.</w:t>
-      </w:r>
-    </w:p>
-    <w:p>
-      <w:pPr>
-        <w:pStyle w:val="Citao"/>
-      </w:pPr>
-    </w:p>
-    <w:p>
-      <w:pPr>
-        <w:pStyle w:val="Citao"/>
-      </w:pPr>
-      <w:r>
-        <w:t xml:space="preserve">(TRT da 24ª Região; Processo: </w:t>
-      </w:r>
-      <w:r>
-        <w:t xml:space="preserve">(ROT) </w:t>
-      </w:r>
-      <w:r>
-        <w:t>0024499-75.2017.5.24.0061; Data de assinatura: 21-10-2020; Órgão Julgador: Gabinete da Presidência - 2ª Turma; Relator(a): LEONARDO ELY)</w:t>
-      </w:r>
-    </w:p>
-    <w:p>
-      <w:pPr>
-        <w:spacing w:after="0" w:line="360" w:lineRule="auto"/>
-        <w:ind w:firstLine="2552"/>
-        <w:jc w:val="both"/>
-        <w:rPr>
-          <w:rFonts w:ascii="Arial Narrow" w:hAnsi="Arial Narrow" w:cs="Arial"/>
-          <w:sz w:val="24"/>
-          <w:szCs w:val="24"/>
-        </w:rPr>
-      </w:pPr>
-    </w:p>
-    <w:p>
-      <w:pPr>
-        <w:spacing w:after="0" w:line="360" w:lineRule="auto"/>
-        <w:ind w:firstLine="2552"/>
-        <w:jc w:val="both"/>
-        <w:rPr>
-          <w:rFonts w:ascii="Arial Narrow" w:hAnsi="Arial Narrow" w:cs="Arial"/>
-          <w:sz w:val="24"/>
-          <w:szCs w:val="24"/>
-        </w:rPr>
-      </w:pPr>
-      <w:r>
-        <w:rPr>
-          <w:rFonts w:ascii="Arial Narrow" w:hAnsi="Arial Narrow" w:cs="Arial"/>
-          <w:sz w:val="24"/>
-          <w:szCs w:val="24"/>
-        </w:rPr>
-        <w:t>Note, Excelência, que é exatamente o caso d</w:t>
-      </w:r>
-      <w:r>
-        <w:rPr>
-          <w:rFonts w:ascii="Arial Narrow" w:hAnsi="Arial Narrow" w:cs="Arial"/>
-          <w:sz w:val="24"/>
-          <w:szCs w:val="24"/>
-        </w:rPr>
-        <w:t>a parte</w:t>
-      </w:r>
-      <w:r>
-        <w:rPr>
-          <w:rFonts w:ascii="Arial Narrow" w:hAnsi="Arial Narrow" w:cs="Arial"/>
-          <w:sz w:val="24"/>
-          <w:szCs w:val="24"/>
-        </w:rPr>
-        <w:t xml:space="preserve"> Autor</w:t>
-      </w:r>
-      <w:r>
-        <w:rPr>
-          <w:rFonts w:ascii="Arial Narrow" w:hAnsi="Arial Narrow" w:cs="Arial"/>
-          <w:sz w:val="24"/>
-          <w:szCs w:val="24"/>
-        </w:rPr>
-        <w:t>a</w:t>
-      </w:r>
-      <w:r>
-        <w:rPr>
-          <w:rFonts w:ascii="Arial Narrow" w:hAnsi="Arial Narrow" w:cs="Arial"/>
-          <w:sz w:val="24"/>
-          <w:szCs w:val="24"/>
-        </w:rPr>
-        <w:t>. Foi demitid</w:t>
-      </w:r>
-      <w:r>
-        <w:rPr>
-          <w:rFonts w:ascii="Arial Narrow" w:hAnsi="Arial Narrow" w:cs="Arial"/>
-          <w:sz w:val="24"/>
-          <w:szCs w:val="24"/>
-        </w:rPr>
-        <w:t>a</w:t>
-      </w:r>
-      <w:r>
-        <w:rPr>
-          <w:rFonts w:ascii="Arial Narrow" w:hAnsi="Arial Narrow" w:cs="Arial"/>
-          <w:sz w:val="24"/>
-          <w:szCs w:val="24"/>
-        </w:rPr>
-        <w:t xml:space="preserve"> por justa causa, por faltas injustificadas, em momento de recaída. O Tribunal Regional do Trabalho da 1ª Região foi além, conforme decisão abaixo colacionada, a validação da demissão por justa causa, por suposta desídia, no momento em que o empregado está privado da capacidade laboral, vai de encontro com o princípio da função social da propriedade e do princípio da dignidade da pessoa humana, consoante extrai-se:</w:t>
-      </w:r>
-    </w:p>
-    <w:p>
-      <w:pPr>
-        <w:spacing w:after="0" w:line="360" w:lineRule="auto"/>
-        <w:ind w:firstLine="2552"/>
-        <w:jc w:val="both"/>
-        <w:rPr>
-          <w:rFonts w:ascii="Arial Narrow" w:hAnsi="Arial Narrow" w:cs="Arial"/>
-          <w:sz w:val="24"/>
-          <w:szCs w:val="24"/>
-        </w:rPr>
-      </w:pPr>
-    </w:p>
-    <w:p>
-      <w:pPr>
-        <w:pStyle w:val="Citao"/>
-      </w:pPr>
-      <w:r>
-        <w:t xml:space="preserve">RECURSO ORDINÁRIO. JUSTA CAUSA. DESÍDIA. DEPENDÊNCIA QUÍMICA. Uma vez comprovado que, à época das faltas que culminaram em sua dispensa por justa causa por desídia, o Reclamante encontrava-se privado de sua plena capacidade de discernimento e de determinar-se para os atos da vida cotidiana, em função de graves transtornos ocasionados por dependência química, tem-se que não foi atendido um dos requisitos subjetivos para aplicação da justa causa, porquanto inexistente qualquer dolo ou culpa do obreiro no cometimento da falta, pelo que não se pode reputar válida a dispensa. Ademais, considerá-la válida a despedida por justa causa por desídia de empregado que não possuía condições plenas de juízo à época seria passar ao largo da função social da propriedade e do princípio da dignidade da pessoa humana. </w:t>
-      </w:r>
-      <w:r>
-        <w:t xml:space="preserve">(TRT da 1ª Região; Processo: (ROT) 0100362-56.2020.5.01.0066; Data de assinatura: 30-01-2023; Órgão Julgador: Primeira Turma; Relator(a) DALVA MACEDO) </w:t>
-      </w:r>
-      <w:r>
-        <w:t xml:space="preserve"> </w:t>
-      </w:r>
-    </w:p>
-    <w:p>
-      <w:pPr>
-        <w:spacing w:after="0" w:line="360" w:lineRule="auto"/>
-        <w:ind w:firstLine="2552"/>
-        <w:jc w:val="both"/>
-        <w:rPr>
-          <w:rFonts w:ascii="Arial Narrow" w:hAnsi="Arial Narrow" w:cs="Arial"/>
-          <w:sz w:val="24"/>
-          <w:szCs w:val="24"/>
-        </w:rPr>
-      </w:pPr>
-    </w:p>
-    <w:p>
-      <w:pPr>
-        <w:spacing w:after="0" w:line="360" w:lineRule="auto"/>
-        <w:ind w:firstLine="2552"/>
-        <w:jc w:val="both"/>
-        <w:rPr>
-          <w:rFonts w:ascii="Arial Narrow" w:hAnsi="Arial Narrow" w:cs="Arial"/>
-          <w:sz w:val="24"/>
-          <w:szCs w:val="24"/>
-        </w:rPr>
-      </w:pPr>
-      <w:r>
-        <w:rPr>
-          <w:rFonts w:ascii="Arial Narrow" w:hAnsi="Arial Narrow" w:cs="Arial"/>
-          <w:sz w:val="24"/>
-          <w:szCs w:val="24"/>
-        </w:rPr>
-        <w:t>E ainda que se considerasse a ocorrência da falta injustificada, há evidente desproporcionalidade entre a falta cometida pelo empregado e a penalidade aplicada.</w:t>
-      </w:r>
-    </w:p>
-    <w:p>
-      <w:pPr>
-        <w:spacing w:after="0" w:line="360" w:lineRule="auto"/>
-        <w:ind w:firstLine="2552"/>
-        <w:jc w:val="both"/>
-        <w:rPr>
-          <w:rFonts w:ascii="Arial Narrow" w:hAnsi="Arial Narrow" w:cs="Arial"/>
-          <w:sz w:val="24"/>
-          <w:szCs w:val="24"/>
-        </w:rPr>
-      </w:pPr>
-    </w:p>
-    <w:p>
-      <w:pPr>
-        <w:spacing w:after="0" w:line="360" w:lineRule="auto"/>
-        <w:ind w:firstLine="2552"/>
-        <w:jc w:val="both"/>
-        <w:rPr>
-          <w:rFonts w:ascii="Arial Narrow" w:hAnsi="Arial Narrow" w:cs="Arial"/>
-          <w:sz w:val="24"/>
-          <w:szCs w:val="24"/>
-        </w:rPr>
-      </w:pPr>
-      <w:r>
-        <w:rPr>
-          <w:rFonts w:ascii="Arial Narrow" w:hAnsi="Arial Narrow" w:cs="Arial"/>
-          <w:sz w:val="24"/>
-          <w:szCs w:val="24"/>
-        </w:rPr>
-        <w:t xml:space="preserve">Destarte, requer a reversão da demissão por justa causa, declarando a rescisão imotivada do contrato de trabalho, condenando que a Ré efetue o pagamento de todas as verbas rescisórias </w:t>
-      </w:r>
-      <w:r>
-        <w:rPr>
-          <w:rFonts w:ascii="Arial Narrow" w:hAnsi="Arial Narrow" w:cs="Arial"/>
-          <w:sz w:val="24"/>
-          <w:szCs w:val="24"/>
-        </w:rPr>
-        <w:t>à parte</w:t>
-      </w:r>
-      <w:r>
-        <w:rPr>
-          <w:rFonts w:ascii="Arial Narrow" w:hAnsi="Arial Narrow" w:cs="Arial"/>
-          <w:sz w:val="24"/>
-          <w:szCs w:val="24"/>
-        </w:rPr>
-        <w:t xml:space="preserve"> Autor</w:t>
-      </w:r>
-      <w:r>
-        <w:rPr>
-          <w:rFonts w:ascii="Arial Narrow" w:hAnsi="Arial Narrow" w:cs="Arial"/>
-          <w:sz w:val="24"/>
-          <w:szCs w:val="24"/>
-        </w:rPr>
-        <w:t>a</w:t>
-      </w:r>
-      <w:r>
-        <w:rPr>
-          <w:rFonts w:ascii="Arial Narrow" w:hAnsi="Arial Narrow" w:cs="Arial"/>
-          <w:sz w:val="24"/>
-          <w:szCs w:val="24"/>
-        </w:rPr>
-        <w:t>, a saber: saldo de salário (art. 457, 458 e 46</w:t>
-      </w:r>
-      <w:r>
-        <w:rPr>
-          <w:rFonts w:ascii="Arial Narrow" w:hAnsi="Arial Narrow" w:cs="Arial"/>
-          <w:sz w:val="24"/>
-          <w:szCs w:val="24"/>
-        </w:rPr>
-        <w:t>2, todos da CLT); aviso prévio</w:t>
-      </w:r>
-      <w:r>
-        <w:rPr>
-          <w:rFonts w:ascii="Arial Narrow" w:hAnsi="Arial Narrow" w:cs="Arial"/>
-          <w:sz w:val="24"/>
-          <w:szCs w:val="24"/>
-        </w:rPr>
-        <w:t xml:space="preserve">; 13º salário proporcional (art. 7º, VIII, da CF e </w:t>
-      </w:r>
-      <w:proofErr w:type="spellStart"/>
-      <w:r>
-        <w:rPr>
-          <w:rFonts w:ascii="Arial Narrow" w:hAnsi="Arial Narrow" w:cs="Arial"/>
-          <w:sz w:val="24"/>
-          <w:szCs w:val="24"/>
-        </w:rPr>
-        <w:t>arts</w:t>
-      </w:r>
-      <w:proofErr w:type="spellEnd"/>
-      <w:r>
-        <w:rPr>
-          <w:rFonts w:ascii="Arial Narrow" w:hAnsi="Arial Narrow" w:cs="Arial"/>
-          <w:sz w:val="24"/>
-          <w:szCs w:val="24"/>
-        </w:rPr>
-        <w:t xml:space="preserve">. 1º e 2º, da Lei 4.690/62); férias, proporcionais e vencidas, acrescidas de um terço (art. 7º, XVII, da CF e </w:t>
-      </w:r>
-      <w:proofErr w:type="spellStart"/>
-      <w:r>
-        <w:rPr>
-          <w:rFonts w:ascii="Arial Narrow" w:hAnsi="Arial Narrow" w:cs="Arial"/>
-          <w:sz w:val="24"/>
-          <w:szCs w:val="24"/>
-        </w:rPr>
-        <w:t>arts</w:t>
-      </w:r>
-      <w:proofErr w:type="spellEnd"/>
-      <w:r>
-        <w:rPr>
-          <w:rFonts w:ascii="Arial Narrow" w:hAnsi="Arial Narrow" w:cs="Arial"/>
-          <w:sz w:val="24"/>
-          <w:szCs w:val="24"/>
-        </w:rPr>
-        <w:t>. 146 e 147 da CLT); saque do FGTS e multa de 40% (</w:t>
-      </w:r>
-      <w:proofErr w:type="spellStart"/>
-      <w:r>
-        <w:rPr>
-          <w:rFonts w:ascii="Arial Narrow" w:hAnsi="Arial Narrow" w:cs="Arial"/>
-          <w:sz w:val="24"/>
-          <w:szCs w:val="24"/>
-        </w:rPr>
-        <w:t>a</w:t>
-      </w:r>
-      <w:r>
-        <w:rPr>
-          <w:rFonts w:ascii="Arial Narrow" w:hAnsi="Arial Narrow" w:cs="Arial"/>
-          <w:sz w:val="24"/>
-          <w:szCs w:val="24"/>
-        </w:rPr>
-        <w:t>rts</w:t>
-      </w:r>
-      <w:proofErr w:type="spellEnd"/>
-      <w:r>
-        <w:rPr>
-          <w:rFonts w:ascii="Arial Narrow" w:hAnsi="Arial Narrow" w:cs="Arial"/>
-          <w:sz w:val="24"/>
-          <w:szCs w:val="24"/>
-        </w:rPr>
-        <w:t xml:space="preserve">. 18 e 20, da Lei 8.036/90) sobre o saldo que deveria estar depositado na conta </w:t>
-      </w:r>
-      <w:r>
-        <w:rPr>
-          <w:rFonts w:ascii="Arial Narrow" w:hAnsi="Arial Narrow" w:cs="Arial"/>
-          <w:sz w:val="24"/>
-          <w:szCs w:val="24"/>
-        </w:rPr>
-        <w:t>da parte Autora</w:t>
-      </w:r>
-      <w:r>
-        <w:rPr>
-          <w:rFonts w:ascii="Arial Narrow" w:hAnsi="Arial Narrow" w:cs="Arial"/>
-          <w:sz w:val="24"/>
-          <w:szCs w:val="24"/>
-        </w:rPr>
-        <w:t xml:space="preserve"> à época da demissão e também sobre as verbas perseguidas na presente demanda. As férias proporcionais, aliás, devem ser pagas, independentemente da procedência do pedido de reversão.</w:t>
-      </w:r>
-    </w:p>
-    <w:p>
-      <w:pPr>
-        <w:spacing w:after="0" w:line="360" w:lineRule="auto"/>
-        <w:ind w:firstLine="2552"/>
-        <w:jc w:val="both"/>
-        <w:rPr>
-          <w:rFonts w:ascii="Arial Narrow" w:hAnsi="Arial Narrow" w:cs="Arial"/>
-          <w:sz w:val="24"/>
-          <w:szCs w:val="24"/>
-        </w:rPr>
-      </w:pPr>
-    </w:p>
-    <w:p>
-      <w:pPr>
-        <w:spacing w:after="0" w:line="360" w:lineRule="auto"/>
-        <w:ind w:firstLine="2552"/>
-        <w:jc w:val="both"/>
-        <w:rPr>
-          <w:rFonts w:ascii="Arial Narrow" w:hAnsi="Arial Narrow" w:cs="Arial"/>
-          <w:sz w:val="24"/>
-          <w:szCs w:val="24"/>
-        </w:rPr>
-      </w:pPr>
-      <w:r>
-        <w:rPr>
-          <w:rFonts w:ascii="Arial Narrow" w:hAnsi="Arial Narrow" w:cs="Arial"/>
-          <w:sz w:val="24"/>
-          <w:szCs w:val="24"/>
-        </w:rPr>
-        <w:t>Destarte, reconhecida a reversão da justa causa, com a declaração da rescisão do contrato de trabalho sem justa causa, a parte Autora tem direito ao recebimento de todas as verbas acima descritas.</w:t>
-      </w:r>
-    </w:p>
-    <w:p>
-      <w:pPr>
-        <w:spacing w:after="0" w:line="360" w:lineRule="auto"/>
-        <w:jc w:val="both"/>
-        <w:rPr>
-          <w:rFonts w:ascii="Arial Narrow" w:hAnsi="Arial Narrow" w:cs="Arial"/>
-          <w:sz w:val="24"/>
-          <w:szCs w:val="24"/>
-        </w:rPr>
-      </w:pPr>
-    </w:p>
-    <w:p>
-      <w:pPr>
-        <w:spacing w:after="0" w:line="360" w:lineRule="auto"/>
-        <w:jc w:val="both"/>
-        <w:rPr>
-          <w:rFonts w:ascii="Arial Narrow" w:hAnsi="Arial Narrow" w:cs="Arial"/>
-          <w:sz w:val="24"/>
-          <w:szCs w:val="24"/>
-        </w:rPr>
-      </w:pPr>
+        <w:rPr>
+          <w:vanish/>
+        </w:rPr>
+      </w:pPr>
+      <w:r>
+        <w:rPr>
+          <w:vanish/>
+        </w:rPr>
+        <w:t>{/reversao_justa_causa_ativa}</w:t>
+      </w:r>
+    </w:p>
+    <w:p>
+      <w:pPr>
+        <w:rPr>
+          <w:vanish/>
+        </w:rPr>
+      </w:pPr>
+      <w:r>
+        <w:rPr>
+          <w:vanish/>
+        </w:rPr>
+        <w:t>{#acidente_ativo}</w:t>
+      </w:r>
     </w:p>
     <w:p>
       <w:pPr>
@@ -22245,6 +20129,32 @@
     </w:p>
     <w:p>
       <w:pPr>
+        <w:rPr>
+          <w:vanish/>
+        </w:rPr>
+      </w:pPr>
+      <w:r>
+        <w:rPr>
+          <w:vanish/>
+        </w:rPr>
+        <w:t>{/acidente_ativo}</w:t>
+      </w:r>
+    </w:p>
+    <w:p>
+      <w:pPr>
+        <w:rPr>
+          <w:vanish/>
+        </w:rPr>
+      </w:pPr>
+      <w:r>
+        <w:rPr>
+          <w:vanish/>
+        </w:rPr>
+        <w:t>{#doenca_ocupacional_ativa}</w:t>
+      </w:r>
+    </w:p>
+    <w:p>
+      <w:pPr>
         <w:spacing w:after="0" w:line="360" w:lineRule="auto"/>
         <w:jc w:val="both"/>
         <w:rPr>
@@ -24397,6 +22307,19 @@
           <w:szCs w:val="24"/>
         </w:rPr>
       </w:pPr>
+    </w:p>
+    <w:p>
+      <w:pPr>
+        <w:rPr>
+          <w:vanish/>
+        </w:rPr>
+      </w:pPr>
+      <w:r>
+        <w:rPr>
+          <w:vanish/>
+        </w:rPr>
+        <w:t>{/doenca_ocupacional_ativa}</w:t>
+      </w:r>
     </w:p>
     <w:p>
       <w:pPr>

</xml_diff>